<commit_message>
this is a checkpoint where the project is working not up to the mark but working ,this is the base for improvement
</commit_message>
<xml_diff>
--- a/master_template.docx
+++ b/master_template.docx
@@ -9,17 +9,20 @@
         <w:jc w:val="center"/>
         <w:rPr>
           <w:rFonts w:ascii="Arial" w:hAnsi="Arial" w:cs="Arial"/>
-          <w:sz w:val="40"/>
-          <w:szCs w:val="40"/>
+          <w:b/>
+          <w:bCs/>
+          <w:sz w:val="36"/>
+          <w:szCs w:val="36"/>
           <w:lang w:val="en-US"/>
         </w:rPr>
       </w:pPr>
-      <w:proofErr w:type="gramStart"/>
-      <w:r>
-        <w:rPr>
-          <w:rFonts w:ascii="Arial" w:hAnsi="Arial" w:cs="Arial"/>
-          <w:sz w:val="40"/>
-          <w:szCs w:val="40"/>
+      <w:r>
+        <w:rPr>
+          <w:rFonts w:ascii="Arial" w:hAnsi="Arial" w:cs="Arial"/>
+          <w:b/>
+          <w:bCs/>
+          <w:sz w:val="36"/>
+          <w:szCs w:val="36"/>
           <w:lang w:val="en-US"/>
         </w:rPr>
         <w:t xml:space="preserve">{{ </w:t>
@@ -28,56 +31,44 @@
       <w:r>
         <w:rPr>
           <w:rFonts w:ascii="Arial" w:hAnsi="Arial" w:cs="Arial"/>
-          <w:sz w:val="40"/>
-          <w:szCs w:val="40"/>
+          <w:b/>
+          <w:bCs/>
+          <w:sz w:val="36"/>
+          <w:szCs w:val="36"/>
         </w:rPr>
         <w:t>personal_info.name</w:t>
       </w:r>
-      <w:proofErr w:type="gramEnd"/>
-      <w:r>
-        <w:rPr>
-          <w:rFonts w:ascii="Arial" w:hAnsi="Arial" w:cs="Arial"/>
-          <w:sz w:val="40"/>
-          <w:szCs w:val="40"/>
-        </w:rPr>
-        <w:t>|</w:t>
-      </w:r>
-      <w:proofErr w:type="gramStart"/>
-      <w:r>
-        <w:rPr>
-          <w:rFonts w:ascii="Arial" w:hAnsi="Arial" w:cs="Arial"/>
-          <w:sz w:val="40"/>
-          <w:szCs w:val="40"/>
-        </w:rPr>
-        <w:t>upper</w:t>
+      <w:r>
+        <w:rPr>
+          <w:rFonts w:ascii="Arial" w:hAnsi="Arial" w:cs="Arial"/>
+          <w:b/>
+          <w:bCs/>
+          <w:sz w:val="36"/>
+          <w:szCs w:val="36"/>
+        </w:rPr>
+        <w:t>|upper</w:t>
       </w:r>
       <w:proofErr w:type="spellEnd"/>
       <w:r>
         <w:rPr>
           <w:rFonts w:ascii="Arial" w:hAnsi="Arial" w:cs="Arial"/>
-          <w:sz w:val="40"/>
-          <w:szCs w:val="40"/>
+          <w:b/>
+          <w:bCs/>
+          <w:sz w:val="36"/>
+          <w:szCs w:val="36"/>
         </w:rPr>
         <w:t xml:space="preserve"> </w:t>
       </w:r>
       <w:r>
         <w:rPr>
           <w:rFonts w:ascii="Arial" w:hAnsi="Arial" w:cs="Arial"/>
-          <w:sz w:val="40"/>
-          <w:szCs w:val="40"/>
+          <w:b/>
+          <w:bCs/>
+          <w:sz w:val="36"/>
+          <w:szCs w:val="36"/>
           <w:lang w:val="en-US"/>
         </w:rPr>
-        <w:t>}</w:t>
-      </w:r>
-      <w:proofErr w:type="gramEnd"/>
-      <w:r>
-        <w:rPr>
-          <w:rFonts w:ascii="Arial" w:hAnsi="Arial" w:cs="Arial"/>
-          <w:sz w:val="40"/>
-          <w:szCs w:val="40"/>
-          <w:lang w:val="en-US"/>
-        </w:rPr>
-        <w:t>}</w:t>
+        <w:t>}}</w:t>
       </w:r>
     </w:p>
     <w:p>
@@ -91,7 +82,6 @@
           <w:szCs w:val="16"/>
         </w:rPr>
       </w:pPr>
-      <w:proofErr w:type="gramStart"/>
       <w:r>
         <w:rPr>
           <w:rFonts w:ascii="Arial" w:hAnsi="Arial" w:cs="Arial"/>
@@ -107,28 +97,9 @@
           <w:sz w:val="16"/>
           <w:szCs w:val="16"/>
         </w:rPr>
-        <w:t>personal</w:t>
-      </w:r>
-      <w:proofErr w:type="gramEnd"/>
-      <w:r>
-        <w:rPr>
-          <w:rFonts w:ascii="Arial" w:hAnsi="Arial" w:cs="Arial"/>
-          <w:sz w:val="16"/>
-          <w:szCs w:val="16"/>
-        </w:rPr>
-        <w:t>_</w:t>
-      </w:r>
-      <w:proofErr w:type="gramStart"/>
-      <w:r>
-        <w:rPr>
-          <w:rFonts w:ascii="Arial" w:hAnsi="Arial" w:cs="Arial"/>
-          <w:sz w:val="16"/>
-          <w:szCs w:val="16"/>
-        </w:rPr>
-        <w:t>info.phone</w:t>
+        <w:t>personal_info.phone</w:t>
       </w:r>
       <w:proofErr w:type="spellEnd"/>
-      <w:proofErr w:type="gramEnd"/>
       <w:r>
         <w:rPr>
           <w:rFonts w:ascii="Arial" w:hAnsi="Arial" w:cs="Arial"/>
@@ -155,7 +126,6 @@
         </w:rPr>
         <w:t xml:space="preserve"> </w:t>
       </w:r>
-      <w:proofErr w:type="gramStart"/>
       <w:r>
         <w:rPr>
           <w:rFonts w:ascii="Arial" w:hAnsi="Arial" w:cs="Arial"/>
@@ -171,28 +141,9 @@
           <w:sz w:val="16"/>
           <w:szCs w:val="16"/>
         </w:rPr>
-        <w:t>personal</w:t>
-      </w:r>
-      <w:proofErr w:type="gramEnd"/>
-      <w:r>
-        <w:rPr>
-          <w:rFonts w:ascii="Arial" w:hAnsi="Arial" w:cs="Arial"/>
-          <w:sz w:val="16"/>
-          <w:szCs w:val="16"/>
-        </w:rPr>
-        <w:t>_</w:t>
-      </w:r>
-      <w:proofErr w:type="gramStart"/>
-      <w:r>
-        <w:rPr>
-          <w:rFonts w:ascii="Arial" w:hAnsi="Arial" w:cs="Arial"/>
-          <w:sz w:val="16"/>
-          <w:szCs w:val="16"/>
-        </w:rPr>
-        <w:t>info.linkedin</w:t>
+        <w:t>personal_info.linkedin</w:t>
       </w:r>
       <w:proofErr w:type="spellEnd"/>
-      <w:proofErr w:type="gramEnd"/>
       <w:r>
         <w:rPr>
           <w:rFonts w:ascii="Arial" w:hAnsi="Arial" w:cs="Arial"/>
@@ -218,7 +169,6 @@
         </w:rPr>
         <w:t xml:space="preserve">| </w:t>
       </w:r>
-      <w:proofErr w:type="gramStart"/>
       <w:r>
         <w:rPr>
           <w:rFonts w:ascii="Arial" w:hAnsi="Arial" w:cs="Arial"/>
@@ -234,44 +184,16 @@
           <w:sz w:val="16"/>
           <w:szCs w:val="16"/>
         </w:rPr>
-        <w:t>personal</w:t>
-      </w:r>
-      <w:proofErr w:type="gramEnd"/>
+        <w:t>personal_info.github</w:t>
+      </w:r>
+      <w:proofErr w:type="spellEnd"/>
       <w:r>
         <w:rPr>
           <w:rFonts w:ascii="Arial" w:hAnsi="Arial" w:cs="Arial"/>
           <w:sz w:val="16"/>
           <w:szCs w:val="16"/>
         </w:rPr>
-        <w:t>_</w:t>
-      </w:r>
-      <w:proofErr w:type="gramStart"/>
-      <w:r>
-        <w:rPr>
-          <w:rFonts w:ascii="Arial" w:hAnsi="Arial" w:cs="Arial"/>
-          <w:sz w:val="16"/>
-          <w:szCs w:val="16"/>
-        </w:rPr>
-        <w:t>info.github</w:t>
-      </w:r>
-      <w:proofErr w:type="spellEnd"/>
-      <w:proofErr w:type="gramEnd"/>
-      <w:r>
-        <w:rPr>
-          <w:rFonts w:ascii="Arial" w:hAnsi="Arial" w:cs="Arial"/>
-          <w:sz w:val="16"/>
-          <w:szCs w:val="16"/>
-        </w:rPr>
-        <w:t xml:space="preserve"> </w:t>
-      </w:r>
-      <w:proofErr w:type="gramStart"/>
-      <w:r>
-        <w:rPr>
-          <w:rFonts w:ascii="Arial" w:hAnsi="Arial" w:cs="Arial"/>
-          <w:sz w:val="16"/>
-          <w:szCs w:val="16"/>
-        </w:rPr>
-        <w:t>}}</w:t>
+        <w:t xml:space="preserve"> }}</w:t>
       </w:r>
       <w:r>
         <w:rPr>
@@ -282,7 +204,6 @@
         </w:rPr>
         <w:t>|</w:t>
       </w:r>
-      <w:proofErr w:type="gramEnd"/>
       <w:r>
         <w:rPr>
           <w:rFonts w:ascii="Arial" w:hAnsi="Arial" w:cs="Arial"/>
@@ -292,7 +213,6 @@
         </w:rPr>
         <w:t xml:space="preserve"> </w:t>
       </w:r>
-      <w:proofErr w:type="gramStart"/>
       <w:r>
         <w:rPr>
           <w:rFonts w:ascii="Arial" w:hAnsi="Arial" w:cs="Arial"/>
@@ -308,64 +228,35 @@
           <w:sz w:val="16"/>
           <w:szCs w:val="16"/>
         </w:rPr>
-        <w:t>personal</w:t>
-      </w:r>
-      <w:proofErr w:type="gramEnd"/>
+        <w:t>personal_info.email</w:t>
+      </w:r>
+      <w:proofErr w:type="spellEnd"/>
       <w:r>
         <w:rPr>
           <w:rFonts w:ascii="Arial" w:hAnsi="Arial" w:cs="Arial"/>
           <w:sz w:val="16"/>
           <w:szCs w:val="16"/>
         </w:rPr>
-        <w:t>_</w:t>
-      </w:r>
-      <w:proofErr w:type="gramStart"/>
+        <w:t xml:space="preserve"> }}</w:t>
+      </w:r>
       <w:r>
         <w:rPr>
           <w:rFonts w:ascii="Arial" w:hAnsi="Arial" w:cs="Arial"/>
           <w:sz w:val="16"/>
           <w:szCs w:val="16"/>
         </w:rPr>
-        <w:t>info.email</w:t>
-      </w:r>
-      <w:proofErr w:type="spellEnd"/>
-      <w:proofErr w:type="gramEnd"/>
+        <w:t xml:space="preserve"> | {{</w:t>
+      </w:r>
+      <w:proofErr w:type="spellStart"/>
       <w:r>
         <w:rPr>
           <w:rFonts w:ascii="Arial" w:hAnsi="Arial" w:cs="Arial"/>
           <w:sz w:val="16"/>
           <w:szCs w:val="16"/>
         </w:rPr>
-        <w:t xml:space="preserve"> }}</w:t>
-      </w:r>
-      <w:r>
-        <w:rPr>
-          <w:rFonts w:ascii="Arial" w:hAnsi="Arial" w:cs="Arial"/>
-          <w:sz w:val="16"/>
-          <w:szCs w:val="16"/>
-        </w:rPr>
-        <w:t xml:space="preserve"> | {{</w:t>
-      </w:r>
-      <w:proofErr w:type="spellStart"/>
-      <w:r>
-        <w:rPr>
-          <w:rFonts w:ascii="Arial" w:hAnsi="Arial" w:cs="Arial"/>
-          <w:sz w:val="16"/>
-          <w:szCs w:val="16"/>
-        </w:rPr>
-        <w:t>personal_</w:t>
-      </w:r>
-      <w:proofErr w:type="gramStart"/>
-      <w:r>
-        <w:rPr>
-          <w:rFonts w:ascii="Arial" w:hAnsi="Arial" w:cs="Arial"/>
-          <w:sz w:val="16"/>
-          <w:szCs w:val="16"/>
-        </w:rPr>
-        <w:t>info.location</w:t>
+        <w:t>personal_info.location</w:t>
       </w:r>
       <w:proofErr w:type="spellEnd"/>
-      <w:proofErr w:type="gramEnd"/>
       <w:r>
         <w:rPr>
           <w:rFonts w:ascii="Arial" w:hAnsi="Arial" w:cs="Arial"/>
@@ -385,11 +276,24 @@
           <w:b/>
           <w:bCs/>
           <w:smallCaps/>
+          <w:sz w:val="28"/>
+          <w:szCs w:val="28"/>
+          <w:lang w:val="en-US"/>
+        </w:rPr>
+      </w:pPr>
+      <w:r>
+        <w:rPr>
+          <w:rFonts w:ascii="Arial" w:hAnsi="Arial" w:cs="Arial"/>
+          <w:b/>
+          <w:bCs/>
+          <w:smallCaps/>
+          <w:color w:val="auto"/>
           <w:sz w:val="32"/>
           <w:szCs w:val="32"/>
           <w:lang w:val="en-US"/>
         </w:rPr>
-      </w:pPr>
+        <w:br/>
+      </w:r>
       <w:r>
         <w:rPr>
           <w:rFonts w:ascii="Arial" w:hAnsi="Arial" w:cs="Arial"/>
@@ -397,60 +301,36 @@
           <w:bCs/>
           <w:smallCaps/>
           <w:color w:val="auto"/>
-          <w:sz w:val="32"/>
-          <w:szCs w:val="32"/>
+          <w:sz w:val="28"/>
+          <w:szCs w:val="28"/>
           <w:lang w:val="en-US"/>
         </w:rPr>
-        <w:br/>
-      </w:r>
-      <w:r>
+        <w:t>Objective</w:t>
+      </w:r>
+    </w:p>
+    <w:p>
+      <w:pPr>
+        <w:pStyle w:val="Heading1"/>
+        <w:spacing w:before="0" w:after="0"/>
+        <w:contextualSpacing/>
         <w:rPr>
           <w:rFonts w:ascii="Arial" w:hAnsi="Arial" w:cs="Arial"/>
           <w:b/>
           <w:bCs/>
           <w:smallCaps/>
-          <w:color w:val="auto"/>
-          <w:sz w:val="32"/>
-          <w:szCs w:val="32"/>
+          <w:sz w:val="20"/>
+          <w:szCs w:val="20"/>
           <w:lang w:val="en-US"/>
         </w:rPr>
-        <w:t>Objective</w:t>
-      </w:r>
-    </w:p>
-    <w:p>
-      <w:pPr>
-        <w:pStyle w:val="Heading1"/>
-        <w:spacing w:before="0" w:after="0"/>
-        <w:contextualSpacing/>
-        <w:rPr>
-          <w:rFonts w:ascii="Arial" w:hAnsi="Arial" w:cs="Arial"/>
-          <w:b/>
-          <w:bCs/>
-          <w:smallCaps/>
-          <w:sz w:val="32"/>
-          <w:szCs w:val="32"/>
-          <w:lang w:val="en-US"/>
-        </w:rPr>
-      </w:pPr>
-      <w:proofErr w:type="gramStart"/>
-      <w:r>
-        <w:rPr>
-          <w:rFonts w:ascii="Arial" w:eastAsiaTheme="minorHAnsi" w:hAnsi="Arial" w:cs="Arial"/>
-          <w:color w:val="auto"/>
-          <w:sz w:val="24"/>
-          <w:szCs w:val="24"/>
-        </w:rPr>
-        <w:t>{{ summary</w:t>
-      </w:r>
-      <w:proofErr w:type="gramEnd"/>
-      <w:r>
-        <w:rPr>
-          <w:rFonts w:ascii="Arial" w:eastAsiaTheme="minorHAnsi" w:hAnsi="Arial" w:cs="Arial"/>
-          <w:color w:val="auto"/>
-          <w:sz w:val="24"/>
-          <w:szCs w:val="24"/>
-        </w:rPr>
-        <w:t xml:space="preserve"> }}</w:t>
+      </w:pPr>
+      <w:r>
+        <w:rPr>
+          <w:rFonts w:ascii="Arial" w:eastAsiaTheme="minorHAnsi" w:hAnsi="Arial" w:cs="Arial"/>
+          <w:color w:val="auto"/>
+          <w:sz w:val="20"/>
+          <w:szCs w:val="20"/>
+        </w:rPr>
+        <w:t>{{ summary }}</w:t>
       </w:r>
     </w:p>
     <w:p>
@@ -466,11 +346,24 @@
           <w:b/>
           <w:bCs/>
           <w:smallCaps/>
+          <w:sz w:val="28"/>
+          <w:szCs w:val="28"/>
+          <w:lang w:val="en-US"/>
+        </w:rPr>
+      </w:pPr>
+      <w:r>
+        <w:rPr>
+          <w:rFonts w:ascii="Arial" w:hAnsi="Arial" w:cs="Arial"/>
+          <w:b/>
+          <w:bCs/>
+          <w:smallCaps/>
+          <w:color w:val="auto"/>
           <w:sz w:val="32"/>
           <w:szCs w:val="32"/>
           <w:lang w:val="en-US"/>
         </w:rPr>
-      </w:pPr>
+        <w:br/>
+      </w:r>
       <w:r>
         <w:rPr>
           <w:rFonts w:ascii="Arial" w:hAnsi="Arial" w:cs="Arial"/>
@@ -478,21 +371,8 @@
           <w:bCs/>
           <w:smallCaps/>
           <w:color w:val="auto"/>
-          <w:sz w:val="32"/>
-          <w:szCs w:val="32"/>
-          <w:lang w:val="en-US"/>
-        </w:rPr>
-        <w:br/>
-      </w:r>
-      <w:r>
-        <w:rPr>
-          <w:rFonts w:ascii="Arial" w:hAnsi="Arial" w:cs="Arial"/>
-          <w:b/>
-          <w:bCs/>
-          <w:smallCaps/>
-          <w:color w:val="auto"/>
-          <w:sz w:val="32"/>
-          <w:szCs w:val="32"/>
+          <w:sz w:val="28"/>
+          <w:szCs w:val="28"/>
           <w:lang w:val="en-US"/>
         </w:rPr>
         <w:t>Education</w:t>
@@ -506,16 +386,16 @@
         <w:rPr>
           <w:rFonts w:ascii="Arial" w:eastAsiaTheme="minorHAnsi" w:hAnsi="Arial" w:cs="Arial"/>
           <w:color w:val="auto"/>
-          <w:sz w:val="24"/>
-          <w:szCs w:val="24"/>
-        </w:rPr>
-      </w:pPr>
-      <w:r>
-        <w:rPr>
-          <w:rFonts w:ascii="Arial" w:eastAsiaTheme="minorHAnsi" w:hAnsi="Arial" w:cs="Arial"/>
-          <w:color w:val="auto"/>
-          <w:sz w:val="24"/>
-          <w:szCs w:val="24"/>
+          <w:sz w:val="20"/>
+          <w:szCs w:val="20"/>
+        </w:rPr>
+      </w:pPr>
+      <w:r>
+        <w:rPr>
+          <w:rFonts w:ascii="Arial" w:eastAsiaTheme="minorHAnsi" w:hAnsi="Arial" w:cs="Arial"/>
+          <w:color w:val="auto"/>
+          <w:sz w:val="20"/>
+          <w:szCs w:val="20"/>
         </w:rPr>
         <w:t xml:space="preserve">{% for </w:t>
       </w:r>
@@ -524,8 +404,8 @@
         <w:rPr>
           <w:rFonts w:ascii="Arial" w:eastAsiaTheme="minorHAnsi" w:hAnsi="Arial" w:cs="Arial"/>
           <w:color w:val="auto"/>
-          <w:sz w:val="24"/>
-          <w:szCs w:val="24"/>
+          <w:sz w:val="20"/>
+          <w:szCs w:val="20"/>
         </w:rPr>
         <w:t>edu</w:t>
       </w:r>
@@ -534,8 +414,8 @@
         <w:rPr>
           <w:rFonts w:ascii="Arial" w:eastAsiaTheme="minorHAnsi" w:hAnsi="Arial" w:cs="Arial"/>
           <w:color w:val="auto"/>
-          <w:sz w:val="24"/>
-          <w:szCs w:val="24"/>
+          <w:sz w:val="20"/>
+          <w:szCs w:val="20"/>
         </w:rPr>
         <w:t xml:space="preserve"> in education %}</w:t>
       </w:r>
@@ -548,17 +428,16 @@
         <w:rPr>
           <w:rFonts w:ascii="Arial" w:eastAsiaTheme="minorHAnsi" w:hAnsi="Arial" w:cs="Arial"/>
           <w:color w:val="auto"/>
-          <w:sz w:val="24"/>
-          <w:szCs w:val="24"/>
-        </w:rPr>
-      </w:pPr>
-      <w:proofErr w:type="gramStart"/>
-      <w:r>
-        <w:rPr>
-          <w:rFonts w:ascii="Arial" w:eastAsiaTheme="minorHAnsi" w:hAnsi="Arial" w:cs="Arial"/>
-          <w:color w:val="auto"/>
-          <w:sz w:val="24"/>
-          <w:szCs w:val="24"/>
+          <w:sz w:val="20"/>
+          <w:szCs w:val="20"/>
+        </w:rPr>
+      </w:pPr>
+      <w:r>
+        <w:rPr>
+          <w:rFonts w:ascii="Arial" w:eastAsiaTheme="minorHAnsi" w:hAnsi="Arial" w:cs="Arial"/>
+          <w:color w:val="auto"/>
+          <w:sz w:val="20"/>
+          <w:szCs w:val="20"/>
         </w:rPr>
         <w:t xml:space="preserve">{{ </w:t>
       </w:r>
@@ -567,50 +446,20 @@
         <w:rPr>
           <w:rFonts w:ascii="Arial" w:eastAsiaTheme="minorHAnsi" w:hAnsi="Arial" w:cs="Arial"/>
           <w:color w:val="auto"/>
-          <w:sz w:val="24"/>
-          <w:szCs w:val="24"/>
-        </w:rPr>
-        <w:t>edu</w:t>
-      </w:r>
-      <w:proofErr w:type="gramEnd"/>
-      <w:r>
-        <w:rPr>
-          <w:rFonts w:ascii="Arial" w:eastAsiaTheme="minorHAnsi" w:hAnsi="Arial" w:cs="Arial"/>
-          <w:color w:val="auto"/>
-          <w:sz w:val="24"/>
-          <w:szCs w:val="24"/>
-        </w:rPr>
-        <w:t>.</w:t>
-      </w:r>
-      <w:proofErr w:type="gramStart"/>
-      <w:r>
-        <w:rPr>
-          <w:rFonts w:ascii="Arial" w:eastAsiaTheme="minorHAnsi" w:hAnsi="Arial" w:cs="Arial"/>
-          <w:color w:val="auto"/>
-          <w:sz w:val="24"/>
-          <w:szCs w:val="24"/>
-        </w:rPr>
-        <w:t>degree</w:t>
+          <w:sz w:val="20"/>
+          <w:szCs w:val="20"/>
+        </w:rPr>
+        <w:t>edu.degree</w:t>
       </w:r>
       <w:proofErr w:type="spellEnd"/>
       <w:r>
         <w:rPr>
           <w:rFonts w:ascii="Arial" w:eastAsiaTheme="minorHAnsi" w:hAnsi="Arial" w:cs="Arial"/>
           <w:color w:val="auto"/>
-          <w:sz w:val="24"/>
-          <w:szCs w:val="24"/>
-        </w:rPr>
-        <w:t xml:space="preserve"> }</w:t>
-      </w:r>
-      <w:proofErr w:type="gramEnd"/>
-      <w:r>
-        <w:rPr>
-          <w:rFonts w:ascii="Arial" w:eastAsiaTheme="minorHAnsi" w:hAnsi="Arial" w:cs="Arial"/>
-          <w:color w:val="auto"/>
-          <w:sz w:val="24"/>
-          <w:szCs w:val="24"/>
-        </w:rPr>
-        <w:t>}</w:t>
+          <w:sz w:val="20"/>
+          <w:szCs w:val="20"/>
+        </w:rPr>
+        <w:t xml:space="preserve"> }}</w:t>
       </w:r>
     </w:p>
     <w:p>
@@ -621,17 +470,16 @@
         <w:rPr>
           <w:rFonts w:ascii="Arial" w:eastAsiaTheme="minorHAnsi" w:hAnsi="Arial" w:cs="Arial"/>
           <w:color w:val="auto"/>
-          <w:sz w:val="24"/>
-          <w:szCs w:val="24"/>
-        </w:rPr>
-      </w:pPr>
-      <w:proofErr w:type="gramStart"/>
-      <w:r>
-        <w:rPr>
-          <w:rFonts w:ascii="Arial" w:eastAsiaTheme="minorHAnsi" w:hAnsi="Arial" w:cs="Arial"/>
-          <w:color w:val="auto"/>
-          <w:sz w:val="24"/>
-          <w:szCs w:val="24"/>
+          <w:sz w:val="20"/>
+          <w:szCs w:val="20"/>
+        </w:rPr>
+      </w:pPr>
+      <w:r>
+        <w:rPr>
+          <w:rFonts w:ascii="Arial" w:eastAsiaTheme="minorHAnsi" w:hAnsi="Arial" w:cs="Arial"/>
+          <w:color w:val="auto"/>
+          <w:sz w:val="20"/>
+          <w:szCs w:val="20"/>
         </w:rPr>
         <w:t xml:space="preserve">{{ </w:t>
       </w:r>
@@ -640,57 +488,27 @@
         <w:rPr>
           <w:rFonts w:ascii="Arial" w:eastAsiaTheme="minorHAnsi" w:hAnsi="Arial" w:cs="Arial"/>
           <w:color w:val="auto"/>
-          <w:sz w:val="24"/>
-          <w:szCs w:val="24"/>
-        </w:rPr>
-        <w:t>edu</w:t>
-      </w:r>
-      <w:proofErr w:type="gramEnd"/>
-      <w:r>
-        <w:rPr>
-          <w:rFonts w:ascii="Arial" w:eastAsiaTheme="minorHAnsi" w:hAnsi="Arial" w:cs="Arial"/>
-          <w:color w:val="auto"/>
-          <w:sz w:val="24"/>
-          <w:szCs w:val="24"/>
-        </w:rPr>
-        <w:t>.</w:t>
-      </w:r>
-      <w:proofErr w:type="gramStart"/>
-      <w:r>
-        <w:rPr>
-          <w:rFonts w:ascii="Arial" w:eastAsiaTheme="minorHAnsi" w:hAnsi="Arial" w:cs="Arial"/>
-          <w:color w:val="auto"/>
-          <w:sz w:val="24"/>
-          <w:szCs w:val="24"/>
-        </w:rPr>
-        <w:t>university</w:t>
+          <w:sz w:val="20"/>
+          <w:szCs w:val="20"/>
+        </w:rPr>
+        <w:t>edu.university</w:t>
       </w:r>
       <w:proofErr w:type="spellEnd"/>
       <w:r>
         <w:rPr>
           <w:rFonts w:ascii="Arial" w:eastAsiaTheme="minorHAnsi" w:hAnsi="Arial" w:cs="Arial"/>
           <w:color w:val="auto"/>
-          <w:sz w:val="24"/>
-          <w:szCs w:val="24"/>
-        </w:rPr>
-        <w:t xml:space="preserve"> }</w:t>
-      </w:r>
-      <w:proofErr w:type="gramEnd"/>
-      <w:r>
-        <w:rPr>
-          <w:rFonts w:ascii="Arial" w:eastAsiaTheme="minorHAnsi" w:hAnsi="Arial" w:cs="Arial"/>
-          <w:color w:val="auto"/>
-          <w:sz w:val="24"/>
-          <w:szCs w:val="24"/>
-        </w:rPr>
-        <w:t>}</w:t>
-      </w:r>
-      <w:r>
-        <w:rPr>
-          <w:rFonts w:ascii="Arial" w:eastAsiaTheme="minorHAnsi" w:hAnsi="Arial" w:cs="Arial"/>
-          <w:color w:val="auto"/>
-          <w:sz w:val="24"/>
-          <w:szCs w:val="24"/>
+          <w:sz w:val="20"/>
+          <w:szCs w:val="20"/>
+        </w:rPr>
+        <w:t xml:space="preserve"> }}</w:t>
+      </w:r>
+      <w:r>
+        <w:rPr>
+          <w:rFonts w:ascii="Arial" w:eastAsiaTheme="minorHAnsi" w:hAnsi="Arial" w:cs="Arial"/>
+          <w:color w:val="auto"/>
+          <w:sz w:val="20"/>
+          <w:szCs w:val="20"/>
         </w:rPr>
         <w:t xml:space="preserve"> </w:t>
       </w:r>
@@ -698,18 +516,17 @@
         <w:rPr>
           <w:rFonts w:ascii="Arial" w:eastAsiaTheme="minorHAnsi" w:hAnsi="Arial" w:cs="Arial"/>
           <w:color w:val="auto"/>
-          <w:sz w:val="24"/>
-          <w:szCs w:val="24"/>
+          <w:sz w:val="20"/>
+          <w:szCs w:val="20"/>
         </w:rPr>
         <w:t xml:space="preserve">| </w:t>
       </w:r>
-      <w:proofErr w:type="gramStart"/>
-      <w:r>
-        <w:rPr>
-          <w:rFonts w:ascii="Arial" w:eastAsiaTheme="minorHAnsi" w:hAnsi="Arial" w:cs="Arial"/>
-          <w:color w:val="auto"/>
-          <w:sz w:val="24"/>
-          <w:szCs w:val="24"/>
+      <w:r>
+        <w:rPr>
+          <w:rFonts w:ascii="Arial" w:eastAsiaTheme="minorHAnsi" w:hAnsi="Arial" w:cs="Arial"/>
+          <w:color w:val="auto"/>
+          <w:sz w:val="20"/>
+          <w:szCs w:val="20"/>
         </w:rPr>
         <w:t xml:space="preserve">{{ </w:t>
       </w:r>
@@ -718,60 +535,29 @@
         <w:rPr>
           <w:rFonts w:ascii="Arial" w:eastAsiaTheme="minorHAnsi" w:hAnsi="Arial" w:cs="Arial"/>
           <w:color w:val="auto"/>
-          <w:sz w:val="24"/>
-          <w:szCs w:val="24"/>
-        </w:rPr>
-        <w:t>edu</w:t>
-      </w:r>
-      <w:proofErr w:type="gramEnd"/>
-      <w:r>
-        <w:rPr>
-          <w:rFonts w:ascii="Arial" w:eastAsiaTheme="minorHAnsi" w:hAnsi="Arial" w:cs="Arial"/>
-          <w:color w:val="auto"/>
-          <w:sz w:val="24"/>
-          <w:szCs w:val="24"/>
-        </w:rPr>
-        <w:t>.</w:t>
-      </w:r>
-      <w:proofErr w:type="gramStart"/>
-      <w:r>
-        <w:rPr>
-          <w:rFonts w:ascii="Arial" w:eastAsiaTheme="minorHAnsi" w:hAnsi="Arial" w:cs="Arial"/>
-          <w:color w:val="auto"/>
-          <w:sz w:val="24"/>
-          <w:szCs w:val="24"/>
-        </w:rPr>
-        <w:t>location</w:t>
+          <w:sz w:val="20"/>
+          <w:szCs w:val="20"/>
+        </w:rPr>
+        <w:t>edu.location</w:t>
       </w:r>
       <w:proofErr w:type="spellEnd"/>
       <w:r>
         <w:rPr>
           <w:rFonts w:ascii="Arial" w:eastAsiaTheme="minorHAnsi" w:hAnsi="Arial" w:cs="Arial"/>
           <w:color w:val="auto"/>
-          <w:sz w:val="24"/>
-          <w:szCs w:val="24"/>
-        </w:rPr>
-        <w:t xml:space="preserve"> }</w:t>
-      </w:r>
-      <w:proofErr w:type="gramEnd"/>
-      <w:r>
-        <w:rPr>
-          <w:rFonts w:ascii="Arial" w:eastAsiaTheme="minorHAnsi" w:hAnsi="Arial" w:cs="Arial"/>
-          <w:color w:val="auto"/>
-          <w:sz w:val="24"/>
-          <w:szCs w:val="24"/>
-        </w:rPr>
-        <w:t xml:space="preserve">} | </w:t>
-      </w:r>
-      <w:proofErr w:type="gramStart"/>
+          <w:sz w:val="20"/>
+          <w:szCs w:val="20"/>
+        </w:rPr>
+        <w:t xml:space="preserve"> }} | </w:t>
+      </w:r>
       <w:r>
         <w:rPr>
           <w:rFonts w:ascii="Arial" w:eastAsiaTheme="minorHAnsi" w:hAnsi="Arial" w:cs="Arial"/>
           <w:i/>
           <w:iCs/>
           <w:color w:val="auto"/>
-          <w:sz w:val="24"/>
-          <w:szCs w:val="24"/>
+          <w:sz w:val="20"/>
+          <w:szCs w:val="20"/>
         </w:rPr>
         <w:t xml:space="preserve">{{ </w:t>
       </w:r>
@@ -782,160 +568,84 @@
           <w:i/>
           <w:iCs/>
           <w:color w:val="auto"/>
-          <w:sz w:val="24"/>
-          <w:szCs w:val="24"/>
-        </w:rPr>
-        <w:t>edu</w:t>
-      </w:r>
-      <w:proofErr w:type="gramEnd"/>
+          <w:sz w:val="20"/>
+          <w:szCs w:val="20"/>
+        </w:rPr>
+        <w:t>edu.duration</w:t>
+      </w:r>
+      <w:proofErr w:type="spellEnd"/>
       <w:r>
         <w:rPr>
           <w:rFonts w:ascii="Arial" w:eastAsiaTheme="minorHAnsi" w:hAnsi="Arial" w:cs="Arial"/>
           <w:i/>
           <w:iCs/>
           <w:color w:val="auto"/>
-          <w:sz w:val="24"/>
-          <w:szCs w:val="24"/>
-        </w:rPr>
-        <w:t>.</w:t>
-      </w:r>
-      <w:proofErr w:type="gramStart"/>
-      <w:r>
-        <w:rPr>
-          <w:rFonts w:ascii="Arial" w:eastAsiaTheme="minorHAnsi" w:hAnsi="Arial" w:cs="Arial"/>
-          <w:i/>
-          <w:iCs/>
-          <w:color w:val="auto"/>
-          <w:sz w:val="24"/>
-          <w:szCs w:val="24"/>
-        </w:rPr>
-        <w:t>duration</w:t>
+          <w:sz w:val="20"/>
+          <w:szCs w:val="20"/>
+        </w:rPr>
+        <w:t xml:space="preserve"> }}</w:t>
+      </w:r>
+      <w:r>
+        <w:rPr>
+          <w:rFonts w:ascii="Arial" w:eastAsiaTheme="minorHAnsi" w:hAnsi="Arial" w:cs="Arial"/>
+          <w:color w:val="auto"/>
+          <w:sz w:val="20"/>
+          <w:szCs w:val="20"/>
+        </w:rPr>
+        <w:t xml:space="preserve"> | {{ </w:t>
+      </w:r>
+      <w:proofErr w:type="spellStart"/>
+      <w:r>
+        <w:rPr>
+          <w:rFonts w:ascii="Arial" w:eastAsiaTheme="minorHAnsi" w:hAnsi="Arial" w:cs="Arial"/>
+          <w:color w:val="auto"/>
+          <w:sz w:val="20"/>
+          <w:szCs w:val="20"/>
+        </w:rPr>
+        <w:t>edu.score</w:t>
       </w:r>
       <w:proofErr w:type="spellEnd"/>
       <w:r>
         <w:rPr>
           <w:rFonts w:ascii="Arial" w:eastAsiaTheme="minorHAnsi" w:hAnsi="Arial" w:cs="Arial"/>
-          <w:i/>
-          <w:iCs/>
-          <w:color w:val="auto"/>
-          <w:sz w:val="24"/>
-          <w:szCs w:val="24"/>
-        </w:rPr>
-        <w:t xml:space="preserve"> }</w:t>
-      </w:r>
-      <w:proofErr w:type="gramEnd"/>
-      <w:r>
-        <w:rPr>
-          <w:rFonts w:ascii="Arial" w:eastAsiaTheme="minorHAnsi" w:hAnsi="Arial" w:cs="Arial"/>
-          <w:i/>
-          <w:iCs/>
-          <w:color w:val="auto"/>
-          <w:sz w:val="24"/>
-          <w:szCs w:val="24"/>
-        </w:rPr>
-        <w:t>}</w:t>
-      </w:r>
-      <w:r>
-        <w:rPr>
-          <w:rFonts w:ascii="Arial" w:eastAsiaTheme="minorHAnsi" w:hAnsi="Arial" w:cs="Arial"/>
-          <w:color w:val="auto"/>
-          <w:sz w:val="24"/>
-          <w:szCs w:val="24"/>
-        </w:rPr>
-        <w:t xml:space="preserve"> | </w:t>
-      </w:r>
-      <w:proofErr w:type="gramStart"/>
-      <w:r>
-        <w:rPr>
-          <w:rFonts w:ascii="Arial" w:eastAsiaTheme="minorHAnsi" w:hAnsi="Arial" w:cs="Arial"/>
-          <w:color w:val="auto"/>
-          <w:sz w:val="24"/>
-          <w:szCs w:val="24"/>
-        </w:rPr>
-        <w:t xml:space="preserve">{{ </w:t>
+          <w:color w:val="auto"/>
+          <w:sz w:val="20"/>
+          <w:szCs w:val="20"/>
+        </w:rPr>
+        <w:t xml:space="preserve"> }}</w:t>
+      </w:r>
+    </w:p>
+    <w:p>
+      <w:pPr>
+        <w:rPr>
+          <w:rFonts w:ascii="Arial" w:hAnsi="Arial" w:cs="Arial"/>
+          <w:sz w:val="20"/>
+          <w:szCs w:val="20"/>
+        </w:rPr>
+      </w:pPr>
+      <w:r>
+        <w:rPr>
+          <w:rFonts w:ascii="Arial" w:hAnsi="Arial" w:cs="Arial"/>
+          <w:sz w:val="20"/>
+          <w:szCs w:val="20"/>
+        </w:rPr>
+        <w:t xml:space="preserve">{% </w:t>
       </w:r>
       <w:proofErr w:type="spellStart"/>
       <w:r>
         <w:rPr>
-          <w:rFonts w:ascii="Arial" w:eastAsiaTheme="minorHAnsi" w:hAnsi="Arial" w:cs="Arial"/>
-          <w:color w:val="auto"/>
-          <w:sz w:val="24"/>
-          <w:szCs w:val="24"/>
-        </w:rPr>
-        <w:t>edu</w:t>
-      </w:r>
-      <w:proofErr w:type="gramEnd"/>
-      <w:r>
-        <w:rPr>
-          <w:rFonts w:ascii="Arial" w:eastAsiaTheme="minorHAnsi" w:hAnsi="Arial" w:cs="Arial"/>
-          <w:color w:val="auto"/>
-          <w:sz w:val="24"/>
-          <w:szCs w:val="24"/>
-        </w:rPr>
-        <w:t>.</w:t>
-      </w:r>
-      <w:proofErr w:type="gramStart"/>
-      <w:r>
-        <w:rPr>
-          <w:rFonts w:ascii="Arial" w:eastAsiaTheme="minorHAnsi" w:hAnsi="Arial" w:cs="Arial"/>
-          <w:color w:val="auto"/>
-          <w:sz w:val="24"/>
-          <w:szCs w:val="24"/>
-        </w:rPr>
-        <w:t>score</w:t>
+          <w:rFonts w:ascii="Arial" w:hAnsi="Arial" w:cs="Arial"/>
+          <w:sz w:val="20"/>
+          <w:szCs w:val="20"/>
+        </w:rPr>
+        <w:t>endfor</w:t>
       </w:r>
       <w:proofErr w:type="spellEnd"/>
       <w:r>
         <w:rPr>
-          <w:rFonts w:ascii="Arial" w:eastAsiaTheme="minorHAnsi" w:hAnsi="Arial" w:cs="Arial"/>
-          <w:color w:val="auto"/>
-          <w:sz w:val="24"/>
-          <w:szCs w:val="24"/>
-        </w:rPr>
-        <w:t xml:space="preserve"> }</w:t>
-      </w:r>
-      <w:proofErr w:type="gramEnd"/>
-      <w:r>
-        <w:rPr>
-          <w:rFonts w:ascii="Arial" w:eastAsiaTheme="minorHAnsi" w:hAnsi="Arial" w:cs="Arial"/>
-          <w:color w:val="auto"/>
-          <w:sz w:val="24"/>
-          <w:szCs w:val="24"/>
-        </w:rPr>
-        <w:t>}</w:t>
-      </w:r>
-    </w:p>
-    <w:p>
-      <w:pPr>
-        <w:rPr>
-          <w:rFonts w:ascii="Arial" w:hAnsi="Arial" w:cs="Arial"/>
-          <w:sz w:val="24"/>
-          <w:szCs w:val="24"/>
-        </w:rPr>
-      </w:pPr>
-      <w:r>
-        <w:rPr>
-          <w:rFonts w:ascii="Arial" w:hAnsi="Arial" w:cs="Arial"/>
-          <w:sz w:val="24"/>
-          <w:szCs w:val="24"/>
-        </w:rPr>
-        <w:t xml:space="preserve">{% </w:t>
-      </w:r>
-      <w:proofErr w:type="spellStart"/>
-      <w:r>
-        <w:rPr>
-          <w:rFonts w:ascii="Arial" w:hAnsi="Arial" w:cs="Arial"/>
-          <w:sz w:val="24"/>
-          <w:szCs w:val="24"/>
-        </w:rPr>
-        <w:t>endfor</w:t>
-      </w:r>
-      <w:proofErr w:type="spellEnd"/>
-      <w:r>
-        <w:rPr>
-          <w:rFonts w:ascii="Arial" w:hAnsi="Arial" w:cs="Arial"/>
-          <w:sz w:val="24"/>
-          <w:szCs w:val="24"/>
+          <w:rFonts w:ascii="Arial" w:hAnsi="Arial" w:cs="Arial"/>
+          <w:sz w:val="20"/>
+          <w:szCs w:val="20"/>
         </w:rPr>
         <w:t xml:space="preserve"> %}</w:t>
       </w:r>
@@ -962,8 +672,8 @@
           <w:b/>
           <w:bCs/>
           <w:smallCaps/>
-          <w:sz w:val="32"/>
-          <w:szCs w:val="32"/>
+          <w:sz w:val="28"/>
+          <w:szCs w:val="28"/>
           <w:lang w:val="en-US"/>
         </w:rPr>
       </w:pPr>
@@ -974,11 +684,113 @@
           <w:bCs/>
           <w:smallCaps/>
           <w:color w:val="auto"/>
-          <w:sz w:val="32"/>
-          <w:szCs w:val="32"/>
+          <w:sz w:val="28"/>
+          <w:szCs w:val="28"/>
           <w:lang w:val="en-US"/>
         </w:rPr>
         <w:t>Skills</w:t>
+      </w:r>
+    </w:p>
+    <w:p>
+      <w:pPr>
+        <w:pStyle w:val="Heading1"/>
+        <w:contextualSpacing/>
+        <w:rPr>
+          <w:rFonts w:ascii="Arial" w:eastAsiaTheme="minorHAnsi" w:hAnsi="Arial" w:cs="Arial"/>
+          <w:color w:val="auto"/>
+          <w:sz w:val="20"/>
+          <w:szCs w:val="20"/>
+        </w:rPr>
+      </w:pPr>
+      <w:r>
+        <w:rPr>
+          <w:rFonts w:ascii="Arial" w:eastAsiaTheme="minorHAnsi" w:hAnsi="Arial" w:cs="Arial"/>
+          <w:color w:val="auto"/>
+          <w:sz w:val="20"/>
+          <w:szCs w:val="20"/>
+        </w:rPr>
+        <w:t xml:space="preserve">{% for </w:t>
+      </w:r>
+      <w:proofErr w:type="spellStart"/>
+      <w:r>
+        <w:rPr>
+          <w:rFonts w:ascii="Arial" w:eastAsiaTheme="minorHAnsi" w:hAnsi="Arial" w:cs="Arial"/>
+          <w:color w:val="auto"/>
+          <w:sz w:val="20"/>
+          <w:szCs w:val="20"/>
+        </w:rPr>
+        <w:t>sc</w:t>
+      </w:r>
+      <w:proofErr w:type="spellEnd"/>
+      <w:r>
+        <w:rPr>
+          <w:rFonts w:ascii="Arial" w:eastAsiaTheme="minorHAnsi" w:hAnsi="Arial" w:cs="Arial"/>
+          <w:color w:val="auto"/>
+          <w:sz w:val="20"/>
+          <w:szCs w:val="20"/>
+        </w:rPr>
+        <w:t xml:space="preserve"> in skills %}</w:t>
+      </w:r>
+    </w:p>
+    <w:p>
+      <w:pPr>
+        <w:pStyle w:val="Heading1"/>
+        <w:contextualSpacing/>
+        <w:rPr>
+          <w:rFonts w:ascii="Arial" w:eastAsiaTheme="minorHAnsi" w:hAnsi="Arial" w:cs="Arial"/>
+          <w:color w:val="auto"/>
+          <w:sz w:val="20"/>
+          <w:szCs w:val="20"/>
+        </w:rPr>
+      </w:pPr>
+      <w:r>
+        <w:rPr>
+          <w:rFonts w:ascii="Arial" w:eastAsiaTheme="minorHAnsi" w:hAnsi="Arial" w:cs="Arial"/>
+          <w:color w:val="auto"/>
+          <w:sz w:val="20"/>
+          <w:szCs w:val="20"/>
+        </w:rPr>
+        <w:t xml:space="preserve">{{ </w:t>
+      </w:r>
+      <w:proofErr w:type="spellStart"/>
+      <w:r>
+        <w:rPr>
+          <w:rFonts w:ascii="Arial" w:eastAsiaTheme="minorHAnsi" w:hAnsi="Arial" w:cs="Arial"/>
+          <w:color w:val="auto"/>
+          <w:sz w:val="20"/>
+          <w:szCs w:val="20"/>
+        </w:rPr>
+        <w:t>sc.category</w:t>
+      </w:r>
+      <w:proofErr w:type="spellEnd"/>
+      <w:r>
+        <w:rPr>
+          <w:rFonts w:ascii="Arial" w:eastAsiaTheme="minorHAnsi" w:hAnsi="Arial" w:cs="Arial"/>
+          <w:color w:val="auto"/>
+          <w:sz w:val="20"/>
+          <w:szCs w:val="20"/>
+        </w:rPr>
+        <w:t xml:space="preserve"> }}: {{ </w:t>
+      </w:r>
+      <w:proofErr w:type="spellStart"/>
+      <w:r>
+        <w:rPr>
+          <w:rFonts w:ascii="Arial" w:eastAsiaTheme="minorHAnsi" w:hAnsi="Arial" w:cs="Arial"/>
+          <w:color w:val="auto"/>
+          <w:sz w:val="20"/>
+          <w:szCs w:val="20"/>
+        </w:rPr>
+        <w:t>sc.skills</w:t>
+      </w:r>
+      <w:proofErr w:type="spellEnd"/>
+      <w:r>
+        <w:rPr>
+          <w:rFonts w:ascii="Arial" w:eastAsiaTheme="minorHAnsi" w:hAnsi="Arial" w:cs="Arial"/>
+          <w:color w:val="auto"/>
+          <w:sz w:val="20"/>
+          <w:szCs w:val="20"/>
+        </w:rPr>
+        <w:t xml:space="preserve"> }}</w:t>
       </w:r>
     </w:p>
     <w:p>
@@ -989,56 +801,38 @@
         <w:rPr>
           <w:rFonts w:ascii="Arial" w:eastAsiaTheme="minorHAnsi" w:hAnsi="Arial" w:cs="Arial"/>
           <w:color w:val="auto"/>
-          <w:sz w:val="24"/>
-          <w:szCs w:val="24"/>
-        </w:rPr>
-      </w:pPr>
-      <w:proofErr w:type="gramStart"/>
-      <w:r>
-        <w:rPr>
-          <w:rFonts w:ascii="Arial" w:eastAsiaTheme="minorHAnsi" w:hAnsi="Arial" w:cs="Arial"/>
-          <w:color w:val="auto"/>
-          <w:sz w:val="24"/>
-          <w:szCs w:val="24"/>
-        </w:rPr>
-        <w:t>{{</w:t>
-      </w:r>
-      <w:r>
-        <w:rPr>
-          <w:rFonts w:ascii="Arial" w:eastAsiaTheme="minorHAnsi" w:hAnsi="Arial" w:cs="Arial"/>
-          <w:color w:val="auto"/>
-          <w:sz w:val="24"/>
-          <w:szCs w:val="24"/>
-        </w:rPr>
-        <w:t xml:space="preserve"> </w:t>
-      </w:r>
-      <w:r>
-        <w:rPr>
-          <w:rFonts w:ascii="Arial" w:eastAsiaTheme="minorHAnsi" w:hAnsi="Arial" w:cs="Arial"/>
-          <w:color w:val="auto"/>
-          <w:sz w:val="24"/>
-          <w:szCs w:val="24"/>
-        </w:rPr>
-        <w:t>skills</w:t>
-      </w:r>
-      <w:proofErr w:type="gramEnd"/>
-      <w:r>
-        <w:rPr>
-          <w:rFonts w:ascii="Arial" w:eastAsiaTheme="minorHAnsi" w:hAnsi="Arial" w:cs="Arial"/>
-          <w:color w:val="auto"/>
-          <w:sz w:val="24"/>
-          <w:szCs w:val="24"/>
-        </w:rPr>
-        <w:t xml:space="preserve"> </w:t>
-      </w:r>
-      <w:r>
-        <w:rPr>
-          <w:rFonts w:ascii="Arial" w:eastAsiaTheme="minorHAnsi" w:hAnsi="Arial" w:cs="Arial"/>
-          <w:color w:val="auto"/>
-          <w:sz w:val="24"/>
-          <w:szCs w:val="24"/>
-        </w:rPr>
-        <w:t>}}</w:t>
+          <w:sz w:val="20"/>
+          <w:szCs w:val="20"/>
+        </w:rPr>
+      </w:pPr>
+      <w:r>
+        <w:rPr>
+          <w:rFonts w:ascii="Arial" w:eastAsiaTheme="minorHAnsi" w:hAnsi="Arial" w:cs="Arial"/>
+          <w:color w:val="auto"/>
+          <w:sz w:val="20"/>
+          <w:szCs w:val="20"/>
+        </w:rPr>
+        <w:t xml:space="preserve">{% </w:t>
+      </w:r>
+      <w:proofErr w:type="spellStart"/>
+      <w:r>
+        <w:rPr>
+          <w:rFonts w:ascii="Arial" w:eastAsiaTheme="minorHAnsi" w:hAnsi="Arial" w:cs="Arial"/>
+          <w:color w:val="auto"/>
+          <w:sz w:val="20"/>
+          <w:szCs w:val="20"/>
+        </w:rPr>
+        <w:t>endfor</w:t>
+      </w:r>
+      <w:proofErr w:type="spellEnd"/>
+      <w:r>
+        <w:rPr>
+          <w:rFonts w:ascii="Arial" w:eastAsiaTheme="minorHAnsi" w:hAnsi="Arial" w:cs="Arial"/>
+          <w:color w:val="auto"/>
+          <w:sz w:val="20"/>
+          <w:szCs w:val="20"/>
+        </w:rPr>
+        <w:t xml:space="preserve"> %}</w:t>
       </w:r>
     </w:p>
     <w:p>
@@ -1061,8 +855,8 @@
           <w:b/>
           <w:bCs/>
           <w:smallCaps/>
-          <w:sz w:val="36"/>
-          <w:szCs w:val="36"/>
+          <w:sz w:val="28"/>
+          <w:szCs w:val="28"/>
           <w:lang w:val="en-US"/>
         </w:rPr>
       </w:pPr>
@@ -1073,8 +867,8 @@
           <w:bCs/>
           <w:smallCaps/>
           <w:color w:val="auto"/>
-          <w:sz w:val="36"/>
-          <w:szCs w:val="36"/>
+          <w:sz w:val="28"/>
+          <w:szCs w:val="28"/>
           <w:lang w:val="en-US"/>
         </w:rPr>
         <w:t>Projects</w:t>
@@ -1086,15 +880,15 @@
         <w:contextualSpacing/>
         <w:rPr>
           <w:rFonts w:ascii="Arial" w:hAnsi="Arial" w:cs="Arial"/>
-          <w:sz w:val="24"/>
-          <w:szCs w:val="24"/>
-        </w:rPr>
-      </w:pPr>
-      <w:r>
-        <w:rPr>
-          <w:rFonts w:ascii="Arial" w:hAnsi="Arial" w:cs="Arial"/>
-          <w:sz w:val="24"/>
-          <w:szCs w:val="24"/>
+          <w:sz w:val="20"/>
+          <w:szCs w:val="20"/>
+        </w:rPr>
+      </w:pPr>
+      <w:r>
+        <w:rPr>
+          <w:rFonts w:ascii="Arial" w:hAnsi="Arial" w:cs="Arial"/>
+          <w:sz w:val="20"/>
+          <w:szCs w:val="20"/>
         </w:rPr>
         <w:t xml:space="preserve">{% for </w:t>
       </w:r>
@@ -1102,8 +896,8 @@
       <w:r>
         <w:rPr>
           <w:rFonts w:ascii="Arial" w:hAnsi="Arial" w:cs="Arial"/>
-          <w:sz w:val="24"/>
-          <w:szCs w:val="24"/>
+          <w:sz w:val="20"/>
+          <w:szCs w:val="20"/>
         </w:rPr>
         <w:t>proj</w:t>
       </w:r>
@@ -1111,8 +905,8 @@
       <w:r>
         <w:rPr>
           <w:rFonts w:ascii="Arial" w:hAnsi="Arial" w:cs="Arial"/>
-          <w:sz w:val="24"/>
-          <w:szCs w:val="24"/>
+          <w:sz w:val="20"/>
+          <w:szCs w:val="20"/>
         </w:rPr>
         <w:t xml:space="preserve"> in projects %}</w:t>
       </w:r>
@@ -1123,19 +917,18 @@
         <w:contextualSpacing/>
         <w:rPr>
           <w:rFonts w:ascii="Arial" w:hAnsi="Arial" w:cs="Arial"/>
-          <w:sz w:val="24"/>
-          <w:szCs w:val="24"/>
+          <w:sz w:val="20"/>
+          <w:szCs w:val="20"/>
           <w:lang w:val="en-US"/>
         </w:rPr>
       </w:pPr>
-      <w:proofErr w:type="gramStart"/>
       <w:r>
         <w:rPr>
           <w:rFonts w:ascii="Arial" w:hAnsi="Arial" w:cs="Arial"/>
           <w:b/>
           <w:bCs/>
-          <w:sz w:val="24"/>
-          <w:szCs w:val="24"/>
+          <w:sz w:val="20"/>
+          <w:szCs w:val="20"/>
         </w:rPr>
         <w:t xml:space="preserve">{{ </w:t>
       </w:r>
@@ -1145,116 +938,47 @@
           <w:rFonts w:ascii="Arial" w:hAnsi="Arial" w:cs="Arial"/>
           <w:b/>
           <w:bCs/>
-          <w:sz w:val="24"/>
-          <w:szCs w:val="24"/>
-        </w:rPr>
-        <w:t>proj</w:t>
-      </w:r>
-      <w:proofErr w:type="gramEnd"/>
+          <w:sz w:val="20"/>
+          <w:szCs w:val="20"/>
+        </w:rPr>
+        <w:t>proj.title</w:t>
+      </w:r>
+      <w:proofErr w:type="spellEnd"/>
       <w:r>
         <w:rPr>
           <w:rFonts w:ascii="Arial" w:hAnsi="Arial" w:cs="Arial"/>
           <w:b/>
           <w:bCs/>
-          <w:sz w:val="24"/>
-          <w:szCs w:val="24"/>
-        </w:rPr>
-        <w:t>.</w:t>
-      </w:r>
-      <w:proofErr w:type="gramStart"/>
-      <w:r>
-        <w:rPr>
-          <w:rFonts w:ascii="Arial" w:hAnsi="Arial" w:cs="Arial"/>
-          <w:b/>
-          <w:bCs/>
-          <w:sz w:val="24"/>
-          <w:szCs w:val="24"/>
-        </w:rPr>
-        <w:t>title</w:t>
+          <w:sz w:val="20"/>
+          <w:szCs w:val="20"/>
+        </w:rPr>
+        <w:t xml:space="preserve"> }}</w:t>
+      </w:r>
+      <w:r>
+        <w:rPr>
+          <w:rFonts w:ascii="Arial" w:hAnsi="Arial" w:cs="Arial"/>
+          <w:sz w:val="20"/>
+          <w:szCs w:val="20"/>
+        </w:rPr>
+        <w:t xml:space="preserve"> | {{ </w:t>
+      </w:r>
+      <w:proofErr w:type="spellStart"/>
+      <w:r>
+        <w:rPr>
+          <w:rFonts w:ascii="Arial" w:hAnsi="Arial" w:cs="Arial"/>
+          <w:sz w:val="20"/>
+          <w:szCs w:val="20"/>
+        </w:rPr>
+        <w:t>proj.tech_stack</w:t>
       </w:r>
       <w:proofErr w:type="spellEnd"/>
       <w:r>
         <w:rPr>
           <w:rFonts w:ascii="Arial" w:hAnsi="Arial" w:cs="Arial"/>
-          <w:b/>
-          <w:bCs/>
-          <w:sz w:val="24"/>
-          <w:szCs w:val="24"/>
-        </w:rPr>
-        <w:t xml:space="preserve"> }</w:t>
-      </w:r>
-      <w:proofErr w:type="gramEnd"/>
-      <w:r>
-        <w:rPr>
-          <w:rFonts w:ascii="Arial" w:hAnsi="Arial" w:cs="Arial"/>
-          <w:b/>
-          <w:bCs/>
-          <w:sz w:val="24"/>
-          <w:szCs w:val="24"/>
-        </w:rPr>
-        <w:t>}</w:t>
-      </w:r>
-      <w:r>
-        <w:rPr>
-          <w:rFonts w:ascii="Arial" w:hAnsi="Arial" w:cs="Arial"/>
-          <w:sz w:val="24"/>
-          <w:szCs w:val="24"/>
-        </w:rPr>
-        <w:t xml:space="preserve"> | </w:t>
-      </w:r>
-      <w:proofErr w:type="gramStart"/>
-      <w:r>
-        <w:rPr>
-          <w:rFonts w:ascii="Arial" w:hAnsi="Arial" w:cs="Arial"/>
-          <w:sz w:val="24"/>
-          <w:szCs w:val="24"/>
-        </w:rPr>
-        <w:t xml:space="preserve">{{ </w:t>
-      </w:r>
-      <w:proofErr w:type="spellStart"/>
-      <w:r>
-        <w:rPr>
-          <w:rFonts w:ascii="Arial" w:hAnsi="Arial" w:cs="Arial"/>
-          <w:sz w:val="24"/>
-          <w:szCs w:val="24"/>
-        </w:rPr>
-        <w:t>proj</w:t>
-      </w:r>
-      <w:proofErr w:type="gramEnd"/>
-      <w:r>
-        <w:rPr>
-          <w:rFonts w:ascii="Arial" w:hAnsi="Arial" w:cs="Arial"/>
-          <w:sz w:val="24"/>
-          <w:szCs w:val="24"/>
-        </w:rPr>
-        <w:t>.tech_</w:t>
-      </w:r>
-      <w:proofErr w:type="gramStart"/>
-      <w:r>
-        <w:rPr>
-          <w:rFonts w:ascii="Arial" w:hAnsi="Arial" w:cs="Arial"/>
-          <w:sz w:val="24"/>
-          <w:szCs w:val="24"/>
-        </w:rPr>
-        <w:t>stack</w:t>
-      </w:r>
-      <w:proofErr w:type="spellEnd"/>
-      <w:r>
-        <w:rPr>
-          <w:rFonts w:ascii="Arial" w:hAnsi="Arial" w:cs="Arial"/>
-          <w:sz w:val="24"/>
-          <w:szCs w:val="24"/>
-        </w:rPr>
-        <w:t xml:space="preserve"> }</w:t>
-      </w:r>
-      <w:proofErr w:type="gramEnd"/>
-      <w:r>
-        <w:rPr>
-          <w:rFonts w:ascii="Arial" w:hAnsi="Arial" w:cs="Arial"/>
-          <w:sz w:val="24"/>
-          <w:szCs w:val="24"/>
-        </w:rPr>
-        <w:t>}</w:t>
+          <w:sz w:val="20"/>
+          <w:szCs w:val="20"/>
+        </w:rPr>
+        <w:t xml:space="preserve"> }}</w:t>
       </w:r>
     </w:p>
     <w:p>
@@ -1263,35 +987,33 @@
         <w:contextualSpacing/>
         <w:rPr>
           <w:rFonts w:ascii="Arial" w:hAnsi="Arial" w:cs="Arial"/>
-          <w:sz w:val="24"/>
-          <w:szCs w:val="24"/>
-        </w:rPr>
-      </w:pPr>
-      <w:r>
-        <w:rPr>
-          <w:rFonts w:ascii="Arial" w:hAnsi="Arial" w:cs="Arial"/>
-          <w:sz w:val="24"/>
-          <w:szCs w:val="24"/>
+          <w:sz w:val="20"/>
+          <w:szCs w:val="20"/>
+        </w:rPr>
+      </w:pPr>
+      <w:r>
+        <w:rPr>
+          <w:rFonts w:ascii="Arial" w:hAnsi="Arial" w:cs="Arial"/>
+          <w:sz w:val="20"/>
+          <w:szCs w:val="20"/>
         </w:rPr>
         <w:t xml:space="preserve">{% for bullet in </w:t>
       </w:r>
       <w:proofErr w:type="spellStart"/>
-      <w:proofErr w:type="gramStart"/>
-      <w:r>
-        <w:rPr>
-          <w:rFonts w:ascii="Arial" w:hAnsi="Arial" w:cs="Arial"/>
-          <w:sz w:val="24"/>
-          <w:szCs w:val="24"/>
+      <w:r>
+        <w:rPr>
+          <w:rFonts w:ascii="Arial" w:hAnsi="Arial" w:cs="Arial"/>
+          <w:sz w:val="20"/>
+          <w:szCs w:val="20"/>
         </w:rPr>
         <w:t>proj.bullets</w:t>
       </w:r>
       <w:proofErr w:type="spellEnd"/>
-      <w:proofErr w:type="gramEnd"/>
-      <w:r>
-        <w:rPr>
-          <w:rFonts w:ascii="Arial" w:hAnsi="Arial" w:cs="Arial"/>
-          <w:sz w:val="24"/>
-          <w:szCs w:val="24"/>
+      <w:r>
+        <w:rPr>
+          <w:rFonts w:ascii="Arial" w:hAnsi="Arial" w:cs="Arial"/>
+          <w:sz w:val="20"/>
+          <w:szCs w:val="20"/>
         </w:rPr>
         <w:t xml:space="preserve"> %}</w:t>
       </w:r>
@@ -1302,35 +1024,17 @@
         <w:contextualSpacing/>
         <w:rPr>
           <w:rFonts w:ascii="Arial" w:hAnsi="Arial" w:cs="Arial"/>
-          <w:sz w:val="24"/>
-          <w:szCs w:val="24"/>
-        </w:rPr>
-      </w:pPr>
-      <w:r>
-        <w:rPr>
-          <w:rFonts w:ascii="Arial" w:hAnsi="Arial" w:cs="Arial"/>
-          <w:sz w:val="24"/>
-          <w:szCs w:val="24"/>
-        </w:rPr>
-        <w:t xml:space="preserve"> · </w:t>
-      </w:r>
-      <w:proofErr w:type="gramStart"/>
-      <w:r>
-        <w:rPr>
-          <w:rFonts w:ascii="Arial" w:hAnsi="Arial" w:cs="Arial"/>
-          <w:sz w:val="24"/>
-          <w:szCs w:val="24"/>
-        </w:rPr>
-        <w:t>{{ bullet</w:t>
-      </w:r>
-      <w:proofErr w:type="gramEnd"/>
-      <w:r>
-        <w:rPr>
-          <w:rFonts w:ascii="Arial" w:hAnsi="Arial" w:cs="Arial"/>
-          <w:sz w:val="24"/>
-          <w:szCs w:val="24"/>
-        </w:rPr>
-        <w:t xml:space="preserve"> }}</w:t>
+          <w:sz w:val="20"/>
+          <w:szCs w:val="20"/>
+        </w:rPr>
+      </w:pPr>
+      <w:r>
+        <w:rPr>
+          <w:rFonts w:ascii="Arial" w:hAnsi="Arial" w:cs="Arial"/>
+          <w:sz w:val="20"/>
+          <w:szCs w:val="20"/>
+        </w:rPr>
+        <w:t xml:space="preserve"> · {{ bullet }}</w:t>
       </w:r>
     </w:p>
     <w:p>
@@ -1339,15 +1043,15 @@
         <w:contextualSpacing/>
         <w:rPr>
           <w:rFonts w:ascii="Arial" w:hAnsi="Arial" w:cs="Arial"/>
-          <w:sz w:val="24"/>
-          <w:szCs w:val="24"/>
-        </w:rPr>
-      </w:pPr>
-      <w:r>
-        <w:rPr>
-          <w:rFonts w:ascii="Arial" w:hAnsi="Arial" w:cs="Arial"/>
-          <w:sz w:val="24"/>
-          <w:szCs w:val="24"/>
+          <w:sz w:val="20"/>
+          <w:szCs w:val="20"/>
+        </w:rPr>
+      </w:pPr>
+      <w:r>
+        <w:rPr>
+          <w:rFonts w:ascii="Arial" w:hAnsi="Arial" w:cs="Arial"/>
+          <w:sz w:val="20"/>
+          <w:szCs w:val="20"/>
         </w:rPr>
         <w:t xml:space="preserve">{% </w:t>
       </w:r>
@@ -1355,8 +1059,8 @@
       <w:r>
         <w:rPr>
           <w:rFonts w:ascii="Arial" w:hAnsi="Arial" w:cs="Arial"/>
-          <w:sz w:val="24"/>
-          <w:szCs w:val="24"/>
+          <w:sz w:val="20"/>
+          <w:szCs w:val="20"/>
         </w:rPr>
         <w:t>endfor</w:t>
       </w:r>
@@ -1364,8 +1068,8 @@
       <w:r>
         <w:rPr>
           <w:rFonts w:ascii="Arial" w:hAnsi="Arial" w:cs="Arial"/>
-          <w:sz w:val="24"/>
-          <w:szCs w:val="24"/>
+          <w:sz w:val="20"/>
+          <w:szCs w:val="20"/>
         </w:rPr>
         <w:t xml:space="preserve"> %}</w:t>
       </w:r>
@@ -1376,15 +1080,15 @@
         <w:contextualSpacing/>
         <w:rPr>
           <w:rFonts w:ascii="Arial" w:hAnsi="Arial" w:cs="Arial"/>
-          <w:sz w:val="24"/>
-          <w:szCs w:val="24"/>
-        </w:rPr>
-      </w:pPr>
-      <w:r>
-        <w:rPr>
-          <w:rFonts w:ascii="Arial" w:hAnsi="Arial" w:cs="Arial"/>
-          <w:sz w:val="24"/>
-          <w:szCs w:val="24"/>
+          <w:sz w:val="20"/>
+          <w:szCs w:val="20"/>
+        </w:rPr>
+      </w:pPr>
+      <w:r>
+        <w:rPr>
+          <w:rFonts w:ascii="Arial" w:hAnsi="Arial" w:cs="Arial"/>
+          <w:sz w:val="20"/>
+          <w:szCs w:val="20"/>
         </w:rPr>
         <w:t xml:space="preserve">{% </w:t>
       </w:r>
@@ -1392,8 +1096,8 @@
       <w:r>
         <w:rPr>
           <w:rFonts w:ascii="Arial" w:hAnsi="Arial" w:cs="Arial"/>
-          <w:sz w:val="24"/>
-          <w:szCs w:val="24"/>
+          <w:sz w:val="20"/>
+          <w:szCs w:val="20"/>
         </w:rPr>
         <w:t>endfor</w:t>
       </w:r>
@@ -1401,8 +1105,8 @@
       <w:r>
         <w:rPr>
           <w:rFonts w:ascii="Arial" w:hAnsi="Arial" w:cs="Arial"/>
-          <w:sz w:val="24"/>
-          <w:szCs w:val="24"/>
+          <w:sz w:val="20"/>
+          <w:szCs w:val="20"/>
         </w:rPr>
         <w:t xml:space="preserve"> %}</w:t>
       </w:r>
@@ -1427,8 +1131,6 @@
         <w:contextualSpacing/>
         <w:rPr>
           <w:rFonts w:ascii="Arial" w:hAnsi="Arial" w:cs="Arial"/>
-          <w:b/>
-          <w:bCs/>
           <w:sz w:val="32"/>
           <w:szCs w:val="32"/>
         </w:rPr>
@@ -1436,354 +1138,10 @@
       <w:r>
         <w:rPr>
           <w:rFonts w:ascii="Arial" w:hAnsi="Arial" w:cs="Arial"/>
-          <w:b/>
-          <w:bCs/>
           <w:sz w:val="32"/>
           <w:szCs w:val="32"/>
         </w:rPr>
-        <w:t>Experience</w:t>
-      </w:r>
-    </w:p>
-    <w:p>
-      <w:pPr>
-        <w:spacing w:line="216" w:lineRule="auto"/>
-        <w:contextualSpacing/>
-        <w:rPr>
-          <w:rFonts w:ascii="Arial" w:hAnsi="Arial" w:cs="Arial"/>
-          <w:sz w:val="24"/>
-          <w:szCs w:val="24"/>
-        </w:rPr>
-      </w:pPr>
-      <w:r>
-        <w:rPr>
-          <w:rFonts w:ascii="Arial" w:hAnsi="Arial" w:cs="Arial"/>
-          <w:sz w:val="24"/>
-          <w:szCs w:val="24"/>
-        </w:rPr>
-        <w:t>{% for job in experience %}</w:t>
-      </w:r>
-    </w:p>
-    <w:p>
-      <w:pPr>
-        <w:spacing w:line="216" w:lineRule="auto"/>
-        <w:contextualSpacing/>
-        <w:rPr>
-          <w:rFonts w:ascii="Arial" w:hAnsi="Arial" w:cs="Arial"/>
-          <w:sz w:val="24"/>
-          <w:szCs w:val="24"/>
-        </w:rPr>
-      </w:pPr>
-      <w:proofErr w:type="gramStart"/>
-      <w:r>
-        <w:rPr>
-          <w:rFonts w:ascii="Arial" w:hAnsi="Arial" w:cs="Arial"/>
-          <w:sz w:val="24"/>
-          <w:szCs w:val="24"/>
-        </w:rPr>
-        <w:t xml:space="preserve">{{ </w:t>
-      </w:r>
-      <w:proofErr w:type="spellStart"/>
-      <w:r>
-        <w:rPr>
-          <w:rFonts w:ascii="Arial" w:hAnsi="Arial" w:cs="Arial"/>
-          <w:sz w:val="24"/>
-          <w:szCs w:val="24"/>
-        </w:rPr>
-        <w:t>job.job</w:t>
-      </w:r>
-      <w:proofErr w:type="gramEnd"/>
-      <w:r>
-        <w:rPr>
-          <w:rFonts w:ascii="Arial" w:hAnsi="Arial" w:cs="Arial"/>
-          <w:sz w:val="24"/>
-          <w:szCs w:val="24"/>
-        </w:rPr>
-        <w:t>_</w:t>
-      </w:r>
-      <w:proofErr w:type="gramStart"/>
-      <w:r>
-        <w:rPr>
-          <w:rFonts w:ascii="Arial" w:hAnsi="Arial" w:cs="Arial"/>
-          <w:sz w:val="24"/>
-          <w:szCs w:val="24"/>
-        </w:rPr>
-        <w:t>title</w:t>
-      </w:r>
-      <w:proofErr w:type="spellEnd"/>
-      <w:r>
-        <w:rPr>
-          <w:rFonts w:ascii="Arial" w:hAnsi="Arial" w:cs="Arial"/>
-          <w:sz w:val="24"/>
-          <w:szCs w:val="24"/>
-        </w:rPr>
-        <w:t xml:space="preserve"> }</w:t>
-      </w:r>
-      <w:proofErr w:type="gramEnd"/>
-      <w:r>
-        <w:rPr>
-          <w:rFonts w:ascii="Arial" w:hAnsi="Arial" w:cs="Arial"/>
-          <w:sz w:val="24"/>
-          <w:szCs w:val="24"/>
-        </w:rPr>
-        <w:t xml:space="preserve">} | </w:t>
-      </w:r>
-      <w:proofErr w:type="gramStart"/>
-      <w:r>
-        <w:rPr>
-          <w:rFonts w:ascii="Arial" w:hAnsi="Arial" w:cs="Arial"/>
-          <w:sz w:val="24"/>
-          <w:szCs w:val="24"/>
-        </w:rPr>
-        <w:t xml:space="preserve">{{ </w:t>
-      </w:r>
-      <w:proofErr w:type="spellStart"/>
-      <w:r>
-        <w:rPr>
-          <w:rFonts w:ascii="Arial" w:hAnsi="Arial" w:cs="Arial"/>
-          <w:sz w:val="24"/>
-          <w:szCs w:val="24"/>
-        </w:rPr>
-        <w:t>job</w:t>
-      </w:r>
-      <w:proofErr w:type="gramEnd"/>
-      <w:r>
-        <w:rPr>
-          <w:rFonts w:ascii="Arial" w:hAnsi="Arial" w:cs="Arial"/>
-          <w:sz w:val="24"/>
-          <w:szCs w:val="24"/>
-        </w:rPr>
-        <w:t>.</w:t>
-      </w:r>
-      <w:proofErr w:type="gramStart"/>
-      <w:r>
-        <w:rPr>
-          <w:rFonts w:ascii="Arial" w:hAnsi="Arial" w:cs="Arial"/>
-          <w:sz w:val="24"/>
-          <w:szCs w:val="24"/>
-        </w:rPr>
-        <w:t>company</w:t>
-      </w:r>
-      <w:proofErr w:type="spellEnd"/>
-      <w:r>
-        <w:rPr>
-          <w:rFonts w:ascii="Arial" w:hAnsi="Arial" w:cs="Arial"/>
-          <w:sz w:val="24"/>
-          <w:szCs w:val="24"/>
-        </w:rPr>
-        <w:t xml:space="preserve"> }</w:t>
-      </w:r>
-      <w:proofErr w:type="gramEnd"/>
-      <w:r>
-        <w:rPr>
-          <w:rFonts w:ascii="Arial" w:hAnsi="Arial" w:cs="Arial"/>
-          <w:sz w:val="24"/>
-          <w:szCs w:val="24"/>
-        </w:rPr>
-        <w:t xml:space="preserve">} | </w:t>
-      </w:r>
-      <w:proofErr w:type="gramStart"/>
-      <w:r>
-        <w:rPr>
-          <w:rFonts w:ascii="Arial" w:hAnsi="Arial" w:cs="Arial"/>
-          <w:sz w:val="24"/>
-          <w:szCs w:val="24"/>
-        </w:rPr>
-        <w:t xml:space="preserve">{{ </w:t>
-      </w:r>
-      <w:proofErr w:type="spellStart"/>
-      <w:r>
-        <w:rPr>
-          <w:rFonts w:ascii="Arial" w:hAnsi="Arial" w:cs="Arial"/>
-          <w:sz w:val="24"/>
-          <w:szCs w:val="24"/>
-        </w:rPr>
-        <w:t>job</w:t>
-      </w:r>
-      <w:proofErr w:type="gramEnd"/>
-      <w:r>
-        <w:rPr>
-          <w:rFonts w:ascii="Arial" w:hAnsi="Arial" w:cs="Arial"/>
-          <w:sz w:val="24"/>
-          <w:szCs w:val="24"/>
-        </w:rPr>
-        <w:t>.</w:t>
-      </w:r>
-      <w:proofErr w:type="gramStart"/>
-      <w:r>
-        <w:rPr>
-          <w:rFonts w:ascii="Arial" w:hAnsi="Arial" w:cs="Arial"/>
-          <w:sz w:val="24"/>
-          <w:szCs w:val="24"/>
-        </w:rPr>
-        <w:t>duration</w:t>
-      </w:r>
-      <w:proofErr w:type="spellEnd"/>
-      <w:r>
-        <w:rPr>
-          <w:rFonts w:ascii="Arial" w:hAnsi="Arial" w:cs="Arial"/>
-          <w:sz w:val="24"/>
-          <w:szCs w:val="24"/>
-        </w:rPr>
-        <w:t xml:space="preserve"> }</w:t>
-      </w:r>
-      <w:proofErr w:type="gramEnd"/>
-      <w:r>
-        <w:rPr>
-          <w:rFonts w:ascii="Arial" w:hAnsi="Arial" w:cs="Arial"/>
-          <w:sz w:val="24"/>
-          <w:szCs w:val="24"/>
-        </w:rPr>
-        <w:t>}</w:t>
-      </w:r>
-    </w:p>
-    <w:p>
-      <w:pPr>
-        <w:spacing w:line="216" w:lineRule="auto"/>
-        <w:contextualSpacing/>
-        <w:rPr>
-          <w:rFonts w:ascii="Arial" w:hAnsi="Arial" w:cs="Arial"/>
-          <w:sz w:val="24"/>
-          <w:szCs w:val="24"/>
-        </w:rPr>
-      </w:pPr>
-      <w:r>
-        <w:rPr>
-          <w:rFonts w:ascii="Arial" w:hAnsi="Arial" w:cs="Arial"/>
-          <w:sz w:val="24"/>
-          <w:szCs w:val="24"/>
-        </w:rPr>
-        <w:t xml:space="preserve">{% for bullet in </w:t>
-      </w:r>
-      <w:proofErr w:type="spellStart"/>
-      <w:proofErr w:type="gramStart"/>
-      <w:r>
-        <w:rPr>
-          <w:rFonts w:ascii="Arial" w:hAnsi="Arial" w:cs="Arial"/>
-          <w:sz w:val="24"/>
-          <w:szCs w:val="24"/>
-        </w:rPr>
-        <w:t>job.bullets</w:t>
-      </w:r>
-      <w:proofErr w:type="spellEnd"/>
-      <w:proofErr w:type="gramEnd"/>
-      <w:r>
-        <w:rPr>
-          <w:rFonts w:ascii="Arial" w:hAnsi="Arial" w:cs="Arial"/>
-          <w:sz w:val="24"/>
-          <w:szCs w:val="24"/>
-        </w:rPr>
-        <w:t xml:space="preserve"> %}</w:t>
-      </w:r>
-    </w:p>
-    <w:p>
-      <w:pPr>
-        <w:spacing w:line="216" w:lineRule="auto"/>
-        <w:contextualSpacing/>
-        <w:rPr>
-          <w:rFonts w:ascii="Arial" w:hAnsi="Arial" w:cs="Arial"/>
-          <w:sz w:val="24"/>
-          <w:szCs w:val="24"/>
-        </w:rPr>
-      </w:pPr>
-      <w:r>
-        <w:rPr>
-          <w:rFonts w:ascii="Arial" w:hAnsi="Arial" w:cs="Arial"/>
-          <w:sz w:val="24"/>
-          <w:szCs w:val="24"/>
-        </w:rPr>
-        <w:t xml:space="preserve"> · </w:t>
-      </w:r>
-      <w:proofErr w:type="gramStart"/>
-      <w:r>
-        <w:rPr>
-          <w:rFonts w:ascii="Arial" w:hAnsi="Arial" w:cs="Arial"/>
-          <w:sz w:val="24"/>
-          <w:szCs w:val="24"/>
-        </w:rPr>
-        <w:t>{{ bullet</w:t>
-      </w:r>
-      <w:proofErr w:type="gramEnd"/>
-      <w:r>
-        <w:rPr>
-          <w:rFonts w:ascii="Arial" w:hAnsi="Arial" w:cs="Arial"/>
-          <w:sz w:val="24"/>
-          <w:szCs w:val="24"/>
-        </w:rPr>
-        <w:t xml:space="preserve"> }}</w:t>
-      </w:r>
-    </w:p>
-    <w:p>
-      <w:pPr>
-        <w:spacing w:line="216" w:lineRule="auto"/>
-        <w:contextualSpacing/>
-        <w:rPr>
-          <w:rFonts w:ascii="Arial" w:hAnsi="Arial" w:cs="Arial"/>
-          <w:sz w:val="24"/>
-          <w:szCs w:val="24"/>
-        </w:rPr>
-      </w:pPr>
-      <w:r>
-        <w:rPr>
-          <w:rFonts w:ascii="Arial" w:hAnsi="Arial" w:cs="Arial"/>
-          <w:sz w:val="24"/>
-          <w:szCs w:val="24"/>
-        </w:rPr>
-        <w:t xml:space="preserve">{% </w:t>
-      </w:r>
-      <w:proofErr w:type="spellStart"/>
-      <w:r>
-        <w:rPr>
-          <w:rFonts w:ascii="Arial" w:hAnsi="Arial" w:cs="Arial"/>
-          <w:sz w:val="24"/>
-          <w:szCs w:val="24"/>
-        </w:rPr>
-        <w:t>endfor</w:t>
-      </w:r>
-      <w:proofErr w:type="spellEnd"/>
-      <w:r>
-        <w:rPr>
-          <w:rFonts w:ascii="Arial" w:hAnsi="Arial" w:cs="Arial"/>
-          <w:sz w:val="24"/>
-          <w:szCs w:val="24"/>
-        </w:rPr>
-        <w:t xml:space="preserve"> %}</w:t>
-      </w:r>
-    </w:p>
-    <w:p>
-      <w:pPr>
-        <w:spacing w:line="216" w:lineRule="auto"/>
-        <w:contextualSpacing/>
-        <w:rPr>
-          <w:rFonts w:ascii="Arial" w:hAnsi="Arial" w:cs="Arial"/>
-          <w:sz w:val="24"/>
-          <w:szCs w:val="24"/>
-        </w:rPr>
-      </w:pPr>
-      <w:r>
-        <w:rPr>
-          <w:rFonts w:ascii="Arial" w:hAnsi="Arial" w:cs="Arial"/>
-          <w:sz w:val="24"/>
-          <w:szCs w:val="24"/>
-        </w:rPr>
-        <w:t xml:space="preserve">{% </w:t>
-      </w:r>
-      <w:proofErr w:type="spellStart"/>
-      <w:r>
-        <w:rPr>
-          <w:rFonts w:ascii="Arial" w:hAnsi="Arial" w:cs="Arial"/>
-          <w:sz w:val="24"/>
-          <w:szCs w:val="24"/>
-        </w:rPr>
-        <w:t>endfor</w:t>
-      </w:r>
-      <w:proofErr w:type="spellEnd"/>
-      <w:r>
-        <w:rPr>
-          <w:rFonts w:ascii="Arial" w:hAnsi="Arial" w:cs="Arial"/>
-          <w:sz w:val="24"/>
-          <w:szCs w:val="24"/>
-        </w:rPr>
-        <w:t xml:space="preserve"> %}</w:t>
+        <w:t>{% if experience %}</w:t>
       </w:r>
     </w:p>
     <w:p>
@@ -1795,29 +1153,321 @@
         <w:contextualSpacing/>
         <w:rPr>
           <w:rFonts w:ascii="Arial" w:hAnsi="Arial" w:cs="Arial"/>
-          <w:sz w:val="24"/>
-          <w:szCs w:val="24"/>
-          <w:lang w:val="en-US"/>
-        </w:rPr>
-      </w:pPr>
-      <w:r>
-        <w:rPr>
-          <w:rFonts w:ascii="Arial" w:hAnsi="Arial" w:cs="Arial"/>
-          <w:sz w:val="24"/>
-          <w:szCs w:val="24"/>
-        </w:rPr>
-        <w:br/>
-      </w:r>
-      <w:r>
-        <w:rPr>
-          <w:rFonts w:ascii="Arial" w:hAnsi="Arial" w:cs="Arial"/>
           <w:b/>
           <w:bCs/>
+          <w:sz w:val="28"/>
+          <w:szCs w:val="28"/>
+        </w:rPr>
+      </w:pPr>
+      <w:r>
+        <w:rPr>
+          <w:rFonts w:ascii="Arial" w:hAnsi="Arial" w:cs="Arial"/>
+          <w:b/>
+          <w:bCs/>
+          <w:sz w:val="28"/>
+          <w:szCs w:val="28"/>
+        </w:rPr>
+        <w:t>Experience</w:t>
+      </w:r>
+    </w:p>
+    <w:p>
+      <w:pPr>
+        <w:spacing w:line="216" w:lineRule="auto"/>
+        <w:contextualSpacing/>
+        <w:rPr>
+          <w:rFonts w:ascii="Arial" w:hAnsi="Arial" w:cs="Arial"/>
+          <w:sz w:val="20"/>
+          <w:szCs w:val="20"/>
+        </w:rPr>
+      </w:pPr>
+      <w:r>
+        <w:rPr>
+          <w:rFonts w:ascii="Arial" w:hAnsi="Arial" w:cs="Arial"/>
+          <w:sz w:val="20"/>
+          <w:szCs w:val="20"/>
+        </w:rPr>
+        <w:t>{% for job in experience %}</w:t>
+      </w:r>
+    </w:p>
+    <w:p>
+      <w:pPr>
+        <w:spacing w:line="216" w:lineRule="auto"/>
+        <w:contextualSpacing/>
+        <w:rPr>
+          <w:rFonts w:ascii="Arial" w:hAnsi="Arial" w:cs="Arial"/>
+          <w:sz w:val="20"/>
+          <w:szCs w:val="20"/>
+        </w:rPr>
+      </w:pPr>
+      <w:r>
+        <w:rPr>
+          <w:rFonts w:ascii="Arial" w:hAnsi="Arial" w:cs="Arial"/>
+          <w:sz w:val="20"/>
+          <w:szCs w:val="20"/>
+        </w:rPr>
+        <w:t xml:space="preserve">{{ </w:t>
+      </w:r>
+      <w:proofErr w:type="spellStart"/>
+      <w:r>
+        <w:rPr>
+          <w:rFonts w:ascii="Arial" w:hAnsi="Arial" w:cs="Arial"/>
+          <w:sz w:val="20"/>
+          <w:szCs w:val="20"/>
+        </w:rPr>
+        <w:t>job.job_title</w:t>
+      </w:r>
+      <w:proofErr w:type="spellEnd"/>
+      <w:r>
+        <w:rPr>
+          <w:rFonts w:ascii="Arial" w:hAnsi="Arial" w:cs="Arial"/>
+          <w:sz w:val="20"/>
+          <w:szCs w:val="20"/>
+        </w:rPr>
+        <w:t xml:space="preserve"> }} | {{ </w:t>
+      </w:r>
+      <w:proofErr w:type="spellStart"/>
+      <w:r>
+        <w:rPr>
+          <w:rFonts w:ascii="Arial" w:hAnsi="Arial" w:cs="Arial"/>
+          <w:sz w:val="20"/>
+          <w:szCs w:val="20"/>
+        </w:rPr>
+        <w:t>job.company</w:t>
+      </w:r>
+      <w:proofErr w:type="spellEnd"/>
+      <w:r>
+        <w:rPr>
+          <w:rFonts w:ascii="Arial" w:hAnsi="Arial" w:cs="Arial"/>
+          <w:sz w:val="20"/>
+          <w:szCs w:val="20"/>
+        </w:rPr>
+        <w:t xml:space="preserve"> }} | {{ </w:t>
+      </w:r>
+      <w:proofErr w:type="spellStart"/>
+      <w:r>
+        <w:rPr>
+          <w:rFonts w:ascii="Arial" w:hAnsi="Arial" w:cs="Arial"/>
+          <w:sz w:val="20"/>
+          <w:szCs w:val="20"/>
+        </w:rPr>
+        <w:t>job.duration</w:t>
+      </w:r>
+      <w:proofErr w:type="spellEnd"/>
+      <w:r>
+        <w:rPr>
+          <w:rFonts w:ascii="Arial" w:hAnsi="Arial" w:cs="Arial"/>
+          <w:sz w:val="20"/>
+          <w:szCs w:val="20"/>
+        </w:rPr>
+        <w:t xml:space="preserve"> }}</w:t>
+      </w:r>
+    </w:p>
+    <w:p>
+      <w:pPr>
+        <w:spacing w:line="216" w:lineRule="auto"/>
+        <w:contextualSpacing/>
+        <w:rPr>
+          <w:rFonts w:ascii="Arial" w:hAnsi="Arial" w:cs="Arial"/>
+          <w:sz w:val="20"/>
+          <w:szCs w:val="20"/>
+        </w:rPr>
+      </w:pPr>
+      <w:r>
+        <w:rPr>
+          <w:rFonts w:ascii="Arial" w:hAnsi="Arial" w:cs="Arial"/>
+          <w:sz w:val="20"/>
+          <w:szCs w:val="20"/>
+        </w:rPr>
+        <w:t xml:space="preserve">{% for bullet in </w:t>
+      </w:r>
+      <w:proofErr w:type="spellStart"/>
+      <w:r>
+        <w:rPr>
+          <w:rFonts w:ascii="Arial" w:hAnsi="Arial" w:cs="Arial"/>
+          <w:sz w:val="20"/>
+          <w:szCs w:val="20"/>
+        </w:rPr>
+        <w:t>job.bullets</w:t>
+      </w:r>
+      <w:proofErr w:type="spellEnd"/>
+      <w:r>
+        <w:rPr>
+          <w:rFonts w:ascii="Arial" w:hAnsi="Arial" w:cs="Arial"/>
+          <w:sz w:val="20"/>
+          <w:szCs w:val="20"/>
+        </w:rPr>
+        <w:t xml:space="preserve"> %}</w:t>
+      </w:r>
+    </w:p>
+    <w:p>
+      <w:pPr>
+        <w:spacing w:line="216" w:lineRule="auto"/>
+        <w:contextualSpacing/>
+        <w:rPr>
+          <w:rFonts w:ascii="Arial" w:hAnsi="Arial" w:cs="Arial"/>
+          <w:sz w:val="20"/>
+          <w:szCs w:val="20"/>
+        </w:rPr>
+      </w:pPr>
+      <w:r>
+        <w:rPr>
+          <w:rFonts w:ascii="Arial" w:hAnsi="Arial" w:cs="Arial"/>
+          <w:sz w:val="20"/>
+          <w:szCs w:val="20"/>
+        </w:rPr>
+        <w:t xml:space="preserve"> · {{ bullet }}</w:t>
+      </w:r>
+    </w:p>
+    <w:p>
+      <w:pPr>
+        <w:spacing w:line="216" w:lineRule="auto"/>
+        <w:contextualSpacing/>
+        <w:rPr>
+          <w:rFonts w:ascii="Arial" w:hAnsi="Arial" w:cs="Arial"/>
+          <w:sz w:val="20"/>
+          <w:szCs w:val="20"/>
+        </w:rPr>
+      </w:pPr>
+      <w:r>
+        <w:rPr>
+          <w:rFonts w:ascii="Arial" w:hAnsi="Arial" w:cs="Arial"/>
+          <w:sz w:val="20"/>
+          <w:szCs w:val="20"/>
+        </w:rPr>
+        <w:t xml:space="preserve">{% </w:t>
+      </w:r>
+      <w:proofErr w:type="spellStart"/>
+      <w:r>
+        <w:rPr>
+          <w:rFonts w:ascii="Arial" w:hAnsi="Arial" w:cs="Arial"/>
+          <w:sz w:val="20"/>
+          <w:szCs w:val="20"/>
+        </w:rPr>
+        <w:t>endfor</w:t>
+      </w:r>
+      <w:proofErr w:type="spellEnd"/>
+      <w:r>
+        <w:rPr>
+          <w:rFonts w:ascii="Arial" w:hAnsi="Arial" w:cs="Arial"/>
+          <w:sz w:val="20"/>
+          <w:szCs w:val="20"/>
+        </w:rPr>
+        <w:t xml:space="preserve"> %}</w:t>
+      </w:r>
+    </w:p>
+    <w:p>
+      <w:pPr>
+        <w:spacing w:line="216" w:lineRule="auto"/>
+        <w:contextualSpacing/>
+        <w:rPr>
+          <w:rFonts w:ascii="Arial" w:hAnsi="Arial" w:cs="Arial"/>
+          <w:sz w:val="20"/>
+          <w:szCs w:val="20"/>
+        </w:rPr>
+      </w:pPr>
+      <w:r>
+        <w:rPr>
+          <w:rFonts w:ascii="Arial" w:hAnsi="Arial" w:cs="Arial"/>
+          <w:sz w:val="20"/>
+          <w:szCs w:val="20"/>
+        </w:rPr>
+        <w:t xml:space="preserve">{% </w:t>
+      </w:r>
+      <w:proofErr w:type="spellStart"/>
+      <w:r>
+        <w:rPr>
+          <w:rFonts w:ascii="Arial" w:hAnsi="Arial" w:cs="Arial"/>
+          <w:sz w:val="20"/>
+          <w:szCs w:val="20"/>
+        </w:rPr>
+        <w:t>endfor</w:t>
+      </w:r>
+      <w:proofErr w:type="spellEnd"/>
+      <w:r>
+        <w:rPr>
+          <w:rFonts w:ascii="Arial" w:hAnsi="Arial" w:cs="Arial"/>
+          <w:sz w:val="20"/>
+          <w:szCs w:val="20"/>
+        </w:rPr>
+        <w:t xml:space="preserve"> %}</w:t>
+      </w:r>
+    </w:p>
+    <w:p>
+      <w:pPr>
+        <w:spacing w:line="216" w:lineRule="auto"/>
+        <w:contextualSpacing/>
+        <w:rPr>
+          <w:rFonts w:ascii="Arial" w:hAnsi="Arial" w:cs="Arial"/>
+          <w:sz w:val="20"/>
+          <w:szCs w:val="20"/>
+        </w:rPr>
+      </w:pPr>
+      <w:r>
+        <w:rPr>
+          <w:rFonts w:ascii="Arial" w:hAnsi="Arial" w:cs="Arial"/>
+          <w:sz w:val="20"/>
+          <w:szCs w:val="20"/>
+        </w:rPr>
+        <w:t>{% endif %}</w:t>
+      </w:r>
+    </w:p>
+    <w:p>
+      <w:pPr>
+        <w:pBdr>
+          <w:bottom w:val="single" w:sz="4" w:space="1" w:color="auto"/>
+        </w:pBdr>
+        <w:spacing w:line="216" w:lineRule="auto"/>
+        <w:contextualSpacing/>
+        <w:rPr>
+          <w:rFonts w:ascii="Arial" w:hAnsi="Arial" w:cs="Arial"/>
           <w:smallCaps/>
           <w:sz w:val="36"/>
           <w:szCs w:val="36"/>
           <w:lang w:val="en-US"/>
         </w:rPr>
+      </w:pPr>
+      <w:r>
+        <w:rPr>
+          <w:rFonts w:ascii="Arial" w:hAnsi="Arial" w:cs="Arial"/>
+          <w:sz w:val="24"/>
+          <w:szCs w:val="24"/>
+        </w:rPr>
+        <w:br/>
+      </w:r>
+      <w:r>
+        <w:rPr>
+          <w:rFonts w:ascii="Arial" w:hAnsi="Arial" w:cs="Arial"/>
+          <w:smallCaps/>
+          <w:sz w:val="36"/>
+          <w:szCs w:val="36"/>
+        </w:rPr>
+        <w:t>{% if certifications %}</w:t>
+      </w:r>
+    </w:p>
+    <w:p>
+      <w:pPr>
+        <w:pBdr>
+          <w:bottom w:val="single" w:sz="4" w:space="1" w:color="auto"/>
+        </w:pBdr>
+        <w:spacing w:line="216" w:lineRule="auto"/>
+        <w:contextualSpacing/>
+        <w:rPr>
+          <w:rFonts w:ascii="Arial" w:hAnsi="Arial" w:cs="Arial"/>
+          <w:sz w:val="28"/>
+          <w:szCs w:val="28"/>
+          <w:lang w:val="en-US"/>
+        </w:rPr>
+      </w:pPr>
+      <w:r>
+        <w:rPr>
+          <w:rFonts w:ascii="Arial" w:hAnsi="Arial" w:cs="Arial"/>
+          <w:b/>
+          <w:bCs/>
+          <w:smallCaps/>
+          <w:sz w:val="28"/>
+          <w:szCs w:val="28"/>
+          <w:lang w:val="en-US"/>
+        </w:rPr>
         <w:t>Certifications</w:t>
       </w:r>
     </w:p>
@@ -1829,16 +1479,16 @@
         <w:rPr>
           <w:rFonts w:ascii="Arial" w:eastAsiaTheme="minorHAnsi" w:hAnsi="Arial" w:cs="Arial"/>
           <w:color w:val="auto"/>
-          <w:sz w:val="24"/>
-          <w:szCs w:val="24"/>
-        </w:rPr>
-      </w:pPr>
-      <w:r>
-        <w:rPr>
-          <w:rFonts w:ascii="Arial" w:eastAsiaTheme="minorHAnsi" w:hAnsi="Arial" w:cs="Arial"/>
-          <w:color w:val="auto"/>
-          <w:sz w:val="24"/>
-          <w:szCs w:val="24"/>
+          <w:sz w:val="20"/>
+          <w:szCs w:val="20"/>
+        </w:rPr>
+      </w:pPr>
+      <w:r>
+        <w:rPr>
+          <w:rFonts w:ascii="Arial" w:eastAsiaTheme="minorHAnsi" w:hAnsi="Arial" w:cs="Arial"/>
+          <w:color w:val="auto"/>
+          <w:sz w:val="20"/>
+          <w:szCs w:val="20"/>
         </w:rPr>
         <w:t xml:space="preserve">{% for cert in certifications %} </w:t>
       </w:r>
@@ -1851,29 +1501,18 @@
         <w:rPr>
           <w:rFonts w:ascii="Arial" w:eastAsiaTheme="minorHAnsi" w:hAnsi="Arial" w:cs="Arial"/>
           <w:color w:val="auto"/>
-          <w:sz w:val="24"/>
-          <w:szCs w:val="24"/>
-        </w:rPr>
-      </w:pPr>
-      <w:proofErr w:type="gramStart"/>
-      <w:r>
-        <w:rPr>
-          <w:rFonts w:ascii="Arial" w:eastAsiaTheme="minorHAnsi" w:hAnsi="Arial" w:cs="Arial"/>
-          <w:color w:val="auto"/>
-          <w:sz w:val="24"/>
-          <w:szCs w:val="24"/>
-        </w:rPr>
-        <w:t>{{ cert</w:t>
-      </w:r>
-      <w:proofErr w:type="gramEnd"/>
-      <w:r>
-        <w:rPr>
-          <w:rFonts w:ascii="Arial" w:eastAsiaTheme="minorHAnsi" w:hAnsi="Arial" w:cs="Arial"/>
-          <w:color w:val="auto"/>
-          <w:sz w:val="24"/>
-          <w:szCs w:val="24"/>
-        </w:rPr>
-        <w:t xml:space="preserve"> }}</w:t>
+          <w:sz w:val="20"/>
+          <w:szCs w:val="20"/>
+        </w:rPr>
+      </w:pPr>
+      <w:r>
+        <w:rPr>
+          <w:rFonts w:ascii="Arial" w:eastAsiaTheme="minorHAnsi" w:hAnsi="Arial" w:cs="Arial"/>
+          <w:color w:val="auto"/>
+          <w:sz w:val="20"/>
+          <w:szCs w:val="20"/>
+        </w:rPr>
+        <w:t>{{ cert }}</w:t>
       </w:r>
     </w:p>
     <w:p>
@@ -1884,16 +1523,16 @@
         <w:rPr>
           <w:rFonts w:ascii="Arial" w:eastAsiaTheme="minorHAnsi" w:hAnsi="Arial" w:cs="Arial"/>
           <w:color w:val="auto"/>
-          <w:sz w:val="24"/>
-          <w:szCs w:val="24"/>
-        </w:rPr>
-      </w:pPr>
-      <w:r>
-        <w:rPr>
-          <w:rFonts w:ascii="Arial" w:eastAsiaTheme="minorHAnsi" w:hAnsi="Arial" w:cs="Arial"/>
-          <w:color w:val="auto"/>
-          <w:sz w:val="24"/>
-          <w:szCs w:val="24"/>
+          <w:sz w:val="20"/>
+          <w:szCs w:val="20"/>
+        </w:rPr>
+      </w:pPr>
+      <w:r>
+        <w:rPr>
+          <w:rFonts w:ascii="Arial" w:eastAsiaTheme="minorHAnsi" w:hAnsi="Arial" w:cs="Arial"/>
+          <w:color w:val="auto"/>
+          <w:sz w:val="20"/>
+          <w:szCs w:val="20"/>
         </w:rPr>
         <w:t xml:space="preserve">{% </w:t>
       </w:r>
@@ -1902,8 +1541,8 @@
         <w:rPr>
           <w:rFonts w:ascii="Arial" w:eastAsiaTheme="minorHAnsi" w:hAnsi="Arial" w:cs="Arial"/>
           <w:color w:val="auto"/>
-          <w:sz w:val="24"/>
-          <w:szCs w:val="24"/>
+          <w:sz w:val="20"/>
+          <w:szCs w:val="20"/>
         </w:rPr>
         <w:t>endfor</w:t>
       </w:r>
@@ -1912,10 +1551,39 @@
         <w:rPr>
           <w:rFonts w:ascii="Arial" w:eastAsiaTheme="minorHAnsi" w:hAnsi="Arial" w:cs="Arial"/>
           <w:color w:val="auto"/>
-          <w:sz w:val="24"/>
-          <w:szCs w:val="24"/>
+          <w:sz w:val="20"/>
+          <w:szCs w:val="20"/>
         </w:rPr>
         <w:t xml:space="preserve"> %}</w:t>
+      </w:r>
+    </w:p>
+    <w:p>
+      <w:pPr>
+        <w:rPr>
+          <w:sz w:val="20"/>
+          <w:szCs w:val="20"/>
+        </w:rPr>
+      </w:pPr>
+      <w:r>
+        <w:rPr>
+          <w:sz w:val="20"/>
+          <w:szCs w:val="20"/>
+        </w:rPr>
+        <w:t>{% endi</w:t>
+      </w:r>
+      <w:r>
+        <w:rPr>
+          <w:sz w:val="20"/>
+          <w:szCs w:val="20"/>
+        </w:rPr>
+        <w:t xml:space="preserve">f </w:t>
+      </w:r>
+      <w:r>
+        <w:rPr>
+          <w:sz w:val="20"/>
+          <w:szCs w:val="20"/>
+        </w:rPr>
+        <w:t>%}</w:t>
       </w:r>
     </w:p>
     <w:p>
@@ -1935,12 +1603,40 @@
         <w:contextualSpacing/>
         <w:rPr>
           <w:rFonts w:ascii="Arial" w:hAnsi="Arial" w:cs="Arial"/>
+          <w:smallCaps/>
+          <w:color w:val="auto"/>
+          <w:sz w:val="36"/>
+          <w:szCs w:val="36"/>
+          <w:lang w:val="en-US"/>
+        </w:rPr>
+      </w:pPr>
+      <w:r>
+        <w:rPr>
+          <w:rFonts w:ascii="Arial" w:hAnsi="Arial" w:cs="Arial"/>
+          <w:smallCaps/>
+          <w:color w:val="auto"/>
+          <w:sz w:val="36"/>
+          <w:szCs w:val="36"/>
+        </w:rPr>
+        <w:t>{% if achievements %}</w:t>
+      </w:r>
+    </w:p>
+    <w:p>
+      <w:pPr>
+        <w:pStyle w:val="Heading1"/>
+        <w:pBdr>
+          <w:bottom w:val="single" w:sz="4" w:space="1" w:color="auto"/>
+        </w:pBdr>
+        <w:spacing w:before="0" w:after="0"/>
+        <w:contextualSpacing/>
+        <w:rPr>
+          <w:rFonts w:ascii="Arial" w:hAnsi="Arial" w:cs="Arial"/>
           <w:b/>
           <w:bCs/>
           <w:smallCaps/>
           <w:color w:val="auto"/>
-          <w:sz w:val="44"/>
-          <w:szCs w:val="44"/>
+          <w:sz w:val="28"/>
+          <w:szCs w:val="28"/>
           <w:lang w:val="en-US"/>
         </w:rPr>
       </w:pPr>
@@ -1951,8 +1647,8 @@
           <w:bCs/>
           <w:smallCaps/>
           <w:color w:val="auto"/>
-          <w:sz w:val="36"/>
-          <w:szCs w:val="36"/>
+          <w:sz w:val="28"/>
+          <w:szCs w:val="28"/>
           <w:lang w:val="en-US"/>
         </w:rPr>
         <w:t>Achievements</w:t>
@@ -1963,15 +1659,15 @@
         <w:spacing w:line="216" w:lineRule="auto"/>
         <w:rPr>
           <w:rFonts w:ascii="Arial" w:hAnsi="Arial" w:cs="Arial"/>
-          <w:sz w:val="24"/>
-          <w:szCs w:val="24"/>
-        </w:rPr>
-      </w:pPr>
-      <w:r>
-        <w:rPr>
-          <w:rFonts w:ascii="Arial" w:hAnsi="Arial" w:cs="Arial"/>
-          <w:sz w:val="24"/>
-          <w:szCs w:val="24"/>
+          <w:sz w:val="20"/>
+          <w:szCs w:val="20"/>
+        </w:rPr>
+      </w:pPr>
+      <w:r>
+        <w:rPr>
+          <w:rFonts w:ascii="Arial" w:hAnsi="Arial" w:cs="Arial"/>
+          <w:sz w:val="20"/>
+          <w:szCs w:val="20"/>
         </w:rPr>
         <w:t xml:space="preserve">{% for achievement in achievements %} </w:t>
       </w:r>
@@ -1981,27 +1677,17 @@
         <w:spacing w:line="216" w:lineRule="auto"/>
         <w:rPr>
           <w:rFonts w:ascii="Arial" w:hAnsi="Arial" w:cs="Arial"/>
-          <w:sz w:val="24"/>
-          <w:szCs w:val="24"/>
-        </w:rPr>
-      </w:pPr>
-      <w:proofErr w:type="gramStart"/>
-      <w:r>
-        <w:rPr>
-          <w:rFonts w:ascii="Arial" w:hAnsi="Arial" w:cs="Arial"/>
-          <w:sz w:val="24"/>
-          <w:szCs w:val="24"/>
-        </w:rPr>
-        <w:t>{{ achievement</w:t>
-      </w:r>
-      <w:proofErr w:type="gramEnd"/>
-      <w:r>
-        <w:rPr>
-          <w:rFonts w:ascii="Arial" w:hAnsi="Arial" w:cs="Arial"/>
-          <w:sz w:val="24"/>
-          <w:szCs w:val="24"/>
-        </w:rPr>
-        <w:t xml:space="preserve"> }} </w:t>
+          <w:sz w:val="20"/>
+          <w:szCs w:val="20"/>
+        </w:rPr>
+      </w:pPr>
+      <w:r>
+        <w:rPr>
+          <w:rFonts w:ascii="Arial" w:hAnsi="Arial" w:cs="Arial"/>
+          <w:sz w:val="20"/>
+          <w:szCs w:val="20"/>
+        </w:rPr>
+        <w:t xml:space="preserve">{{ achievement }} </w:t>
       </w:r>
     </w:p>
     <w:p>
@@ -2009,41 +1695,59 @@
         <w:spacing w:line="216" w:lineRule="auto"/>
         <w:rPr>
           <w:rFonts w:ascii="Arial" w:hAnsi="Arial" w:cs="Arial"/>
-          <w:sz w:val="24"/>
-          <w:szCs w:val="24"/>
+          <w:sz w:val="20"/>
+          <w:szCs w:val="20"/>
+        </w:rPr>
+      </w:pPr>
+      <w:r>
+        <w:rPr>
+          <w:rFonts w:ascii="Arial" w:hAnsi="Arial" w:cs="Arial"/>
+          <w:sz w:val="20"/>
+          <w:szCs w:val="20"/>
+        </w:rPr>
+        <w:t xml:space="preserve">{% </w:t>
+      </w:r>
+      <w:proofErr w:type="spellStart"/>
+      <w:r>
+        <w:rPr>
+          <w:rFonts w:ascii="Arial" w:hAnsi="Arial" w:cs="Arial"/>
+          <w:sz w:val="20"/>
+          <w:szCs w:val="20"/>
+        </w:rPr>
+        <w:t>endfor</w:t>
+      </w:r>
+      <w:proofErr w:type="spellEnd"/>
+      <w:r>
+        <w:rPr>
+          <w:rFonts w:ascii="Arial" w:hAnsi="Arial" w:cs="Arial"/>
+          <w:sz w:val="20"/>
+          <w:szCs w:val="20"/>
+        </w:rPr>
+        <w:t xml:space="preserve"> %}</w:t>
+      </w:r>
+    </w:p>
+    <w:p>
+      <w:pPr>
+        <w:spacing w:line="216" w:lineRule="auto"/>
+        <w:rPr>
+          <w:rFonts w:ascii="Arial" w:hAnsi="Arial" w:cs="Arial"/>
+          <w:sz w:val="20"/>
+          <w:szCs w:val="20"/>
           <w:lang w:val="en-US"/>
         </w:rPr>
       </w:pPr>
       <w:r>
         <w:rPr>
           <w:rFonts w:ascii="Arial" w:hAnsi="Arial" w:cs="Arial"/>
-          <w:sz w:val="24"/>
-          <w:szCs w:val="24"/>
-        </w:rPr>
-        <w:t xml:space="preserve">{% </w:t>
-      </w:r>
-      <w:proofErr w:type="spellStart"/>
-      <w:r>
-        <w:rPr>
-          <w:rFonts w:ascii="Arial" w:hAnsi="Arial" w:cs="Arial"/>
-          <w:sz w:val="24"/>
-          <w:szCs w:val="24"/>
-        </w:rPr>
-        <w:t>endfor</w:t>
-      </w:r>
-      <w:proofErr w:type="spellEnd"/>
-      <w:r>
-        <w:rPr>
-          <w:rFonts w:ascii="Arial" w:hAnsi="Arial" w:cs="Arial"/>
-          <w:sz w:val="24"/>
-          <w:szCs w:val="24"/>
-        </w:rPr>
-        <w:t xml:space="preserve"> %}</w:t>
+          <w:sz w:val="20"/>
+          <w:szCs w:val="20"/>
+        </w:rPr>
+        <w:t>{% endif %}</w:t>
       </w:r>
     </w:p>
     <w:sectPr>
       <w:pgSz w:w="11906" w:h="16838" w:code="9"/>
-      <w:pgMar w:top="432" w:right="432" w:bottom="432" w:left="432" w:header="706" w:footer="706" w:gutter="0"/>
+      <w:pgMar w:top="288" w:right="288" w:bottom="288" w:left="288" w:header="706" w:footer="706" w:gutter="0"/>
       <w:cols w:space="708"/>
       <w:docGrid w:linePitch="360"/>
     </w:sectPr>
@@ -2112,7 +1816,7 @@
         <v:path o:extrusionok="f" gradientshapeok="t" o:connecttype="rect"/>
         <o:lock v:ext="edit" aspectratio="t"/>
       </v:shapetype>
-      <v:shape id="_x0000_i1025" type="#_x0000_t75" style="width:11.4pt;height:11.4pt;visibility:visible;mso-wrap-style:square" o:bullet="t">
+      <v:shape id="_x0000_i1025" type="#_x0000_t75" style="width:11.45pt;height:11.45pt;visibility:visible;mso-wrap-style:square" o:bullet="t">
         <v:imagedata r:id="rId1" o:title=""/>
       </v:shape>
     </w:pict>
@@ -3413,6 +3117,7 @@
   <w:style w:type="character" w:default="1" w:styleId="DefaultParagraphFont">
     <w:name w:val="Default Paragraph Font"/>
     <w:uiPriority w:val="1"/>
+    <w:semiHidden/>
     <w:unhideWhenUsed/>
   </w:style>
   <w:style w:type="table" w:default="1" w:styleId="TableNormal">

</xml_diff>